<commit_message>
Added frontend component descriptions (log excluded)
</commit_message>
<xml_diff>
--- a/docs/Team02_Protocol_TourPlanner.docx
+++ b/docs/Team02_Protocol_TourPlanner.docx
@@ -267,24 +267,6 @@
           <w:lang w:val="en-US" w:eastAsia="en-US" w:bidi="ar-SA"/>
         </w:rPr>
         <w:t>DI. Berger Wolfgang</w:t>
-      </w:r>
-    </w:p>
-    <w:p>
-      <w:pPr>
-        <w:pStyle w:val="BodyText"/>
-        <w:ind w:hanging="567"/>
-        <w:rPr>
-          <w:rFonts w:ascii="Times New Roman" w:hAnsi="Times New Roman"/>
-          <w:sz w:val="20"/>
-          <w:lang w:val="en-US" w:eastAsia="en-US" w:bidi="ar-SA"/>
-        </w:rPr>
-      </w:pPr>
-      <w:r>
-        <w:rPr>
-          <w:rFonts w:ascii="Times New Roman" w:hAnsi="Times New Roman"/>
-          <w:sz w:val="20"/>
-          <w:lang w:val="en-US" w:eastAsia="en-US" w:bidi="ar-SA"/>
-        </w:rPr>
       </w:r>
     </w:p>
     <w:p>
@@ -529,15 +511,7 @@
           <w:szCs w:val="36"/>
           <w:lang w:val="en-US" w:eastAsia="en-US" w:bidi="ar-SA"/>
         </w:rPr>
-        <w:t>Registe</w:t>
-      </w:r>
-      <w:r>
-        <w:rPr>
-          <w:sz w:val="36"/>
-          <w:szCs w:val="36"/>
-          <w:lang w:val="en-US" w:eastAsia="en-US" w:bidi="ar-SA"/>
-        </w:rPr>
-        <w:t>r</w:t>
+        <w:t>Register</w:t>
       </w:r>
     </w:p>
     <w:p>
@@ -566,11 +540,7 @@
         </w:rPr>
       </w:pPr>
       <w:r>
-        <w:rPr>
-          <w:lang w:val="en-US" w:eastAsia="en-US" w:bidi="ar-SA"/>
-        </w:rPr>
-      </w:r>
-      <w:r>
+        <w:rPr/>
         <mc:AlternateContent>
           <mc:Choice Requires="wps">
             <w:drawing>
@@ -581,17 +551,28 @@
                 <a:graphic xmlns:a="http://schemas.openxmlformats.org/drawingml/2006/main">
                   <a:graphicData uri="http://schemas.microsoft.com/office/word/2010/wordprocessingShape">
                     <wps:wsp>
-                      <wps:cNvSpPr txBox="1"/>
+                      <wps:cNvSpPr/>
                       <wps:spPr>
                         <a:xfrm>
                           <a:off x="0" y="0"/>
-                          <a:ext cx="3166110" cy="2735580"/>
+                          <a:ext cx="3166200" cy="2735640"/>
                         </a:xfrm>
-                        <a:prstGeom prst="rect"/>
+                        <a:prstGeom prst="rect">
+                          <a:avLst/>
+                        </a:prstGeom>
                         <a:solidFill>
                           <a:srgbClr val="FFFFFF"/>
                         </a:solidFill>
+                        <a:ln w="0">
+                          <a:noFill/>
+                        </a:ln>
                       </wps:spPr>
+                      <wps:style>
+                        <a:lnRef idx="0"/>
+                        <a:fillRef idx="0"/>
+                        <a:effectRef idx="0"/>
+                        <a:fontRef idx="minor"/>
+                      </wps:style>
                       <wps:txbx>
                         <w:txbxContent>
                           <w:p>
@@ -640,6 +621,9 @@
                                   </a:graphic>
                                 </wp:inline>
                               </w:drawing>
+                            </w:r>
+                            <w:r>
+                              <w:rPr/>
                               <w:t xml:space="preserve">Figure </w:t>
                             </w:r>
                             <w:r>
@@ -669,7 +653,7 @@
                           </w:p>
                         </w:txbxContent>
                       </wps:txbx>
-                      <wps:bodyPr anchor="t" lIns="0" tIns="0" rIns="0" bIns="0">
+                      <wps:bodyPr lIns="0" tIns="0" rIns="0" bIns="0" anchor="t">
                         <a:noAutofit/>
                       </wps:bodyPr>
                     </wps:wsp>
@@ -680,8 +664,10 @@
           </mc:Choice>
           <mc:Fallback>
             <w:pict>
-              <v:rect style="position:absolute;rotation:-0;width:249.3pt;height:215.4pt;mso-wrap-distance-left:0pt;mso-wrap-distance-right:0pt;mso-wrap-distance-top:0pt;mso-wrap-distance-bottom:0pt;margin-top:-215.4pt;mso-position-vertical:top;mso-position-vertical-relative:text;margin-left:0pt;mso-position-horizontal:center;mso-position-horizontal-relative:text">
-                <v:textbox inset="0in,0in,0in,0in">
+              <v:rect id="shape_0" fillcolor="white" stroked="f" o:allowincell="f" style="position:absolute;margin-left:0pt;margin-top:-215.45pt;width:249.25pt;height:215.35pt;mso-wrap-style:square;v-text-anchor:top;mso-position-vertical:top">
+                <v:fill o:detectmouseclick="t" type="solid" color2="black"/>
+                <v:stroke color="#3465a4" joinstyle="round" endcap="flat"/>
+                <v:textbox>
                   <w:txbxContent>
                     <w:p>
                       <w:pPr>
@@ -729,6 +715,9 @@
                             </a:graphic>
                           </wp:inline>
                         </w:drawing>
+                      </w:r>
+                      <w:r>
+                        <w:rPr/>
                         <w:t xml:space="preserve">Figure </w:t>
                       </w:r>
                       <w:r>
@@ -758,7 +747,7 @@
                     </w:p>
                   </w:txbxContent>
                 </v:textbox>
-                <w10:wrap type="square" side="largest"/>
+                <w10:wrap type="square"/>
               </v:rect>
             </w:pict>
           </mc:Fallback>
@@ -836,11 +825,7 @@
         </w:rPr>
       </w:pPr>
       <w:r>
-        <w:rPr>
-          <w:lang w:val="en-US" w:eastAsia="en-US" w:bidi="ar-SA"/>
-        </w:rPr>
-      </w:r>
-      <w:r>
+        <w:rPr/>
         <mc:AlternateContent>
           <mc:Choice Requires="wps">
             <w:drawing>
@@ -851,17 +836,28 @@
                 <a:graphic xmlns:a="http://schemas.openxmlformats.org/drawingml/2006/main">
                   <a:graphicData uri="http://schemas.microsoft.com/office/word/2010/wordprocessingShape">
                     <wps:wsp>
-                      <wps:cNvSpPr txBox="1"/>
+                      <wps:cNvSpPr/>
                       <wps:spPr>
                         <a:xfrm>
                           <a:off x="0" y="0"/>
-                          <a:ext cx="6120130" cy="2847975"/>
+                          <a:ext cx="6120000" cy="2847960"/>
                         </a:xfrm>
-                        <a:prstGeom prst="rect"/>
+                        <a:prstGeom prst="rect">
+                          <a:avLst/>
+                        </a:prstGeom>
                         <a:solidFill>
                           <a:srgbClr val="FFFFFF"/>
                         </a:solidFill>
+                        <a:ln w="0">
+                          <a:noFill/>
+                        </a:ln>
                       </wps:spPr>
+                      <wps:style>
+                        <a:lnRef idx="0"/>
+                        <a:fillRef idx="0"/>
+                        <a:effectRef idx="0"/>
+                        <a:fontRef idx="minor"/>
+                      </wps:style>
                       <wps:txbx>
                         <w:txbxContent>
                           <w:p>
@@ -910,6 +906,9 @@
                                   </a:graphic>
                                 </wp:inline>
                               </w:drawing>
+                            </w:r>
+                            <w:r>
+                              <w:rPr/>
                               <w:t xml:space="preserve">Figure </w:t>
                             </w:r>
                             <w:r>
@@ -939,7 +938,7 @@
                           </w:p>
                         </w:txbxContent>
                       </wps:txbx>
-                      <wps:bodyPr anchor="t" lIns="0" tIns="0" rIns="0" bIns="0">
+                      <wps:bodyPr lIns="0" tIns="0" rIns="0" bIns="0" anchor="t">
                         <a:noAutofit/>
                       </wps:bodyPr>
                     </wps:wsp>
@@ -950,8 +949,10 @@
           </mc:Choice>
           <mc:Fallback>
             <w:pict>
-              <v:rect style="position:absolute;rotation:-0;width:481.9pt;height:224.25pt;mso-wrap-distance-left:0pt;mso-wrap-distance-right:0pt;mso-wrap-distance-top:0pt;mso-wrap-distance-bottom:0pt;margin-top:-224.25pt;mso-position-vertical:top;mso-position-vertical-relative:text;margin-left:0pt;mso-position-horizontal:center;mso-position-horizontal-relative:text">
-                <v:textbox inset="0in,0in,0in,0in">
+              <v:rect id="shape_0" fillcolor="white" stroked="f" o:allowincell="f" style="position:absolute;margin-left:0pt;margin-top:-224.3pt;width:481.85pt;height:224.2pt;mso-wrap-style:square;v-text-anchor:top;mso-position-vertical:top">
+                <v:fill o:detectmouseclick="t" type="solid" color2="black"/>
+                <v:stroke color="#3465a4" joinstyle="round" endcap="flat"/>
+                <v:textbox>
                   <w:txbxContent>
                     <w:p>
                       <w:pPr>
@@ -999,6 +1000,9 @@
                             </a:graphic>
                           </wp:inline>
                         </w:drawing>
+                      </w:r>
+                      <w:r>
+                        <w:rPr/>
                         <w:t xml:space="preserve">Figure </w:t>
                       </w:r>
                       <w:r>
@@ -1028,7 +1032,7 @@
                     </w:p>
                   </w:txbxContent>
                 </v:textbox>
-                <w10:wrap type="square" side="largest"/>
+                <w10:wrap type="square"/>
               </v:rect>
             </w:pict>
           </mc:Fallback>
@@ -1047,13 +1051,7 @@
         <w:rPr>
           <w:lang w:val="en-US" w:eastAsia="en-US" w:bidi="ar-SA"/>
         </w:rPr>
-        <w:t xml:space="preserve">The UI design for variant A was chosen, as the overview and amount of information displayed </w:t>
-      </w:r>
-      <w:r>
-        <w:rPr>
-          <w:lang w:val="en-US" w:eastAsia="en-US" w:bidi="ar-SA"/>
-        </w:rPr>
-        <w:t>made debug-testing easier.</w:t>
+        <w:t>The UI design for variant A was chosen, as the overview and amount of information displayed made debug-testing easier.</w:t>
       </w:r>
     </w:p>
     <w:p>
@@ -1098,12 +1096,10 @@
         <w:rPr>
           <w:lang w:val="en-US" w:eastAsia="en-US" w:bidi="ar-SA"/>
         </w:rPr>
-      </w:r>
-      <w:r>
         <mc:AlternateContent>
           <mc:Choice Requires="wps">
             <w:drawing>
-              <wp:anchor distT="0" distB="0" distL="114300" distR="114300" simplePos="0" relativeHeight="26" behindDoc="0" locked="0" layoutInCell="0" allowOverlap="1">
+              <wp:anchor distT="0" distB="0" distL="114300" distR="113665" simplePos="0" relativeHeight="33" behindDoc="0" locked="0" layoutInCell="0" allowOverlap="1">
                 <wp:simplePos x="0" y="0"/>
                 <wp:positionH relativeFrom="column">
                   <wp:posOffset>-323850</wp:posOffset>
@@ -1126,17 +1122,28 @@
                 <a:graphic xmlns:a="http://schemas.openxmlformats.org/drawingml/2006/main">
                   <a:graphicData uri="http://schemas.microsoft.com/office/word/2010/wordprocessingShape">
                     <wps:wsp>
-                      <wps:cNvSpPr txBox="1"/>
+                      <wps:cNvSpPr/>
                       <wps:spPr>
                         <a:xfrm>
                           <a:off x="0" y="0"/>
-                          <a:ext cx="1617980" cy="2796540"/>
+                          <a:ext cx="1617840" cy="2796480"/>
                         </a:xfrm>
-                        <a:prstGeom prst="rect"/>
+                        <a:prstGeom prst="rect">
+                          <a:avLst/>
+                        </a:prstGeom>
                         <a:solidFill>
                           <a:srgbClr val="FFFFFF"/>
                         </a:solidFill>
+                        <a:ln w="0">
+                          <a:noFill/>
+                        </a:ln>
                       </wps:spPr>
+                      <wps:style>
+                        <a:lnRef idx="0"/>
+                        <a:fillRef idx="0"/>
+                        <a:effectRef idx="0"/>
+                        <a:fontRef idx="minor"/>
+                      </wps:style>
                       <wps:txbx>
                         <w:txbxContent>
                           <w:p>
@@ -1185,6 +1192,9 @@
                                   </a:graphic>
                                 </wp:inline>
                               </w:drawing>
+                            </w:r>
+                            <w:r>
+                              <w:rPr/>
                               <w:t xml:space="preserve">Figure </w:t>
                             </w:r>
                             <w:r>
@@ -1214,7 +1224,7 @@
                           </w:p>
                         </w:txbxContent>
                       </wps:txbx>
-                      <wps:bodyPr anchor="t" lIns="0" tIns="0" rIns="0" bIns="0">
+                      <wps:bodyPr lIns="0" tIns="0" rIns="0" bIns="0" anchor="t">
                         <a:noAutofit/>
                       </wps:bodyPr>
                     </wps:wsp>
@@ -1225,8 +1235,10 @@
           </mc:Choice>
           <mc:Fallback>
             <w:pict>
-              <v:rect style="position:absolute;rotation:-0;width:127.4pt;height:220.2pt;mso-wrap-distance-left:9pt;mso-wrap-distance-right:9pt;mso-wrap-distance-top:0pt;mso-wrap-distance-bottom:0pt;margin-top:4.9pt;mso-position-vertical-relative:text;margin-left:-25.5pt;mso-position-horizontal-relative:text">
-                <v:textbox inset="0in,0in,0in,0in">
+              <v:rect id="shape_0" fillcolor="white" stroked="f" o:allowincell="f" style="position:absolute;margin-left:-25.5pt;margin-top:4.9pt;width:127.35pt;height:220.15pt;mso-wrap-style:square;v-text-anchor:top">
+                <v:fill o:detectmouseclick="t" type="solid" color2="black"/>
+                <v:stroke color="#3465a4" joinstyle="round" endcap="flat"/>
+                <v:textbox>
                   <w:txbxContent>
                     <w:p>
                       <w:pPr>
@@ -1274,6 +1286,9 @@
                             </a:graphic>
                           </wp:inline>
                         </w:drawing>
+                      </w:r>
+                      <w:r>
+                        <w:rPr/>
                         <w:t xml:space="preserve">Figure </w:t>
                       </w:r>
                       <w:r>
@@ -1466,7 +1481,7 @@
     <w:p>
       <w:pPr>
         <w:pStyle w:val="fhtwFlietext04Arial"/>
-        <w:ind w:hanging="0" w:start="0"/>
+        <w:ind w:hanging="0" w:start="0" w:end="136"/>
         <w:rPr>
           <w:lang w:val="en-US" w:eastAsia="en-US" w:bidi="ar-SA"/>
         </w:rPr>
@@ -1479,11 +1494,18 @@
       <w:r>
         <w:br w:type="page"/>
       </w:r>
-      <w:r>
+    </w:p>
+    <w:p>
+      <w:pPr>
+        <w:pStyle w:val="Normal"/>
+        <w:rPr/>
+      </w:pPr>
+      <w:r>
+        <w:rPr/>
         <mc:AlternateContent>
           <mc:Choice Requires="wps">
             <w:drawing>
-              <wp:anchor distT="0" distB="0" distL="114300" distR="114300" simplePos="0" relativeHeight="28" behindDoc="0" locked="0" layoutInCell="0" allowOverlap="1">
+              <wp:anchor distT="0" distB="0" distL="114300" distR="114300" simplePos="0" relativeHeight="35" behindDoc="0" locked="0" layoutInCell="0" allowOverlap="1">
                 <wp:simplePos x="0" y="0"/>
                 <wp:positionH relativeFrom="column">
                   <wp:posOffset>-419100</wp:posOffset>
@@ -1498,17 +1520,28 @@
                 <a:graphic xmlns:a="http://schemas.openxmlformats.org/drawingml/2006/main">
                   <a:graphicData uri="http://schemas.microsoft.com/office/word/2010/wordprocessingShape">
                     <wps:wsp>
-                      <wps:cNvSpPr txBox="1"/>
+                      <wps:cNvSpPr/>
                       <wps:spPr>
                         <a:xfrm>
                           <a:off x="0" y="0"/>
-                          <a:ext cx="3524250" cy="3111500"/>
+                          <a:ext cx="3524400" cy="3111480"/>
                         </a:xfrm>
-                        <a:prstGeom prst="rect"/>
+                        <a:prstGeom prst="rect">
+                          <a:avLst/>
+                        </a:prstGeom>
                         <a:solidFill>
                           <a:srgbClr val="FFFFFF"/>
                         </a:solidFill>
+                        <a:ln w="0">
+                          <a:noFill/>
+                        </a:ln>
                       </wps:spPr>
+                      <wps:style>
+                        <a:lnRef idx="0"/>
+                        <a:fillRef idx="0"/>
+                        <a:effectRef idx="0"/>
+                        <a:fontRef idx="minor"/>
+                      </wps:style>
                       <wps:txbx>
                         <w:txbxContent>
                           <w:p>
@@ -1557,6 +1590,9 @@
                                   </a:graphic>
                                 </wp:inline>
                               </w:drawing>
+                            </w:r>
+                            <w:r>
+                              <w:rPr/>
                               <w:t xml:space="preserve">Figure </w:t>
                             </w:r>
                             <w:r>
@@ -1586,7 +1622,7 @@
                           </w:p>
                         </w:txbxContent>
                       </wps:txbx>
-                      <wps:bodyPr anchor="t" lIns="0" tIns="0" rIns="0" bIns="0">
+                      <wps:bodyPr lIns="0" tIns="0" rIns="0" bIns="0" anchor="t">
                         <a:noAutofit/>
                       </wps:bodyPr>
                     </wps:wsp>
@@ -1597,8 +1633,10 @@
           </mc:Choice>
           <mc:Fallback>
             <w:pict>
-              <v:rect style="position:absolute;rotation:-0;width:277.5pt;height:245pt;mso-wrap-distance-left:9pt;mso-wrap-distance-right:9pt;mso-wrap-distance-top:0pt;mso-wrap-distance-bottom:0pt;margin-top:52.45pt;mso-position-vertical-relative:text;margin-left:-33pt;mso-position-horizontal-relative:text">
-                <v:textbox inset="0in,0in,0in,0in">
+              <v:rect id="shape_0" fillcolor="white" stroked="f" o:allowincell="f" style="position:absolute;margin-left:-33pt;margin-top:52.45pt;width:277.45pt;height:244.95pt;mso-wrap-style:square;v-text-anchor:top">
+                <v:fill o:detectmouseclick="t" type="solid" color2="black"/>
+                <v:stroke color="#3465a4" joinstyle="round" endcap="flat"/>
+                <v:textbox>
                   <w:txbxContent>
                     <w:p>
                       <w:pPr>
@@ -1646,6 +1684,9 @@
                             </a:graphic>
                           </wp:inline>
                         </w:drawing>
+                      </w:r>
+                      <w:r>
+                        <w:rPr/>
                         <w:t xml:space="preserve">Figure </w:t>
                       </w:r>
                       <w:r>
@@ -1761,7 +1802,61 @@
         <w:rPr>
           <w:lang w:val="en-US" w:eastAsia="en-US" w:bidi="ar-SA"/>
         </w:rPr>
-        <w:t>[What the Tourshell does]</w:t>
+        <w:t>To increase usability and ease of use, it was decided to split the tour planner page into two parts. The left side displays the tour list view, while the right side is responsible for displaying tour details, tour logs and  the configuration of both.</w:t>
+      </w:r>
+    </w:p>
+    <w:p>
+      <w:pPr>
+        <w:pStyle w:val="fhtwFlietext03Arial"/>
+        <w:rPr>
+          <w:lang w:val="en-US" w:eastAsia="en-US" w:bidi="ar-SA"/>
+        </w:rPr>
+      </w:pPr>
+      <w:r>
+        <w:rPr>
+          <w:lang w:val="en-US" w:eastAsia="en-US" w:bidi="ar-SA"/>
+        </w:rPr>
+      </w:r>
+    </w:p>
+    <w:p>
+      <w:pPr>
+        <w:pStyle w:val="fhtwFlietext03Arial"/>
+        <w:rPr>
+          <w:lang w:val="en-US" w:eastAsia="en-US" w:bidi="ar-SA"/>
+        </w:rPr>
+      </w:pPr>
+      <w:r>
+        <w:rPr>
+          <w:lang w:val="en-US" w:eastAsia="en-US" w:bidi="ar-SA"/>
+        </w:rPr>
+        <w:t>The Tour Shell is responsible for displaying both sides. Its template file references the respective component templates. A state machine controls which one is displayed at any given time.</w:t>
+      </w:r>
+    </w:p>
+    <w:p>
+      <w:pPr>
+        <w:pStyle w:val="fhtwFlietext03Arial"/>
+        <w:rPr>
+          <w:lang w:val="en-US" w:eastAsia="en-US" w:bidi="ar-SA"/>
+        </w:rPr>
+      </w:pPr>
+      <w:r>
+        <w:rPr>
+          <w:lang w:val="en-US" w:eastAsia="en-US" w:bidi="ar-SA"/>
+        </w:rPr>
+      </w:r>
+    </w:p>
+    <w:p>
+      <w:pPr>
+        <w:pStyle w:val="fhtwFlietext03Arial"/>
+        <w:rPr>
+          <w:lang w:val="en-US" w:eastAsia="en-US" w:bidi="ar-SA"/>
+        </w:rPr>
+      </w:pPr>
+      <w:r>
+        <w:rPr>
+          <w:lang w:val="en-US" w:eastAsia="en-US" w:bidi="ar-SA"/>
+        </w:rPr>
+        <w:t xml:space="preserve">Additionally, the Shell acts as a mediator, receiving events triggered by the components and translating them into corresponding actions (e.g., displaying, editing, or deleting a log). </w:t>
       </w:r>
     </w:p>
     <w:p>
@@ -1793,37 +1888,535 @@
           <w:szCs w:val="28"/>
           <w:lang w:val="en-US" w:eastAsia="en-US" w:bidi="ar-SA"/>
         </w:rPr>
-        <w:t>Tour-</w:t>
-      </w:r>
-      <w:r>
+        <w:t>Tour-List:</w:t>
+      </w:r>
+    </w:p>
+    <w:p>
+      <w:pPr>
+        <w:pStyle w:val="fhtwFlietext03Arial"/>
+        <w:rPr>
+          <w:lang w:val="en-US" w:eastAsia="en-US" w:bidi="ar-SA"/>
+        </w:rPr>
+      </w:pPr>
+      <w:r>
+        <w:rPr>
+          <w:lang w:val="en-US" w:eastAsia="en-US" w:bidi="ar-SA"/>
+        </w:rPr>
+        <w:t>The Tour List is the primary navigation component for tours. It forms the left side of the application and serves as the starting point for all further actions, such as viewing, editing, or deleting a tour.</w:t>
+      </w:r>
+    </w:p>
+    <w:p>
+      <w:pPr>
+        <w:pStyle w:val="fhtwFlietext03Arial"/>
+        <w:rPr>
+          <w:lang w:val="en-US" w:eastAsia="en-US" w:bidi="ar-SA"/>
+        </w:rPr>
+      </w:pPr>
+      <w:r>
+        <w:rPr>
+          <w:lang w:val="en-US" w:eastAsia="en-US" w:bidi="ar-SA"/>
+        </w:rPr>
+      </w:r>
+    </w:p>
+    <w:p>
+      <w:pPr>
+        <w:pStyle w:val="fhtwFlietext03Arial"/>
+        <w:rPr>
+          <w:lang w:val="en-US" w:eastAsia="en-US" w:bidi="ar-SA"/>
+        </w:rPr>
+      </w:pPr>
+      <w:r>
+        <w:rPr>
+          <w:lang w:val="en-US" w:eastAsia="en-US" w:bidi="ar-SA"/>
+        </w:rPr>
+        <w:t>Tours are displayed via entries in the list, which users can click for more information.</w:t>
+      </w:r>
+    </w:p>
+    <w:p>
+      <w:pPr>
+        <w:pStyle w:val="fhtwFlietext03Arial"/>
+        <w:rPr>
+          <w:lang w:val="en-US" w:eastAsia="en-US" w:bidi="ar-SA"/>
+        </w:rPr>
+      </w:pPr>
+      <w:r>
+        <w:rPr>
+          <w:lang w:val="en-US" w:eastAsia="en-US" w:bidi="ar-SA"/>
+        </w:rPr>
+      </w:r>
+    </w:p>
+    <w:p>
+      <w:pPr>
+        <w:pStyle w:val="fhtwFlietext03Arial"/>
+        <w:rPr>
+          <w:lang w:val="en-US" w:eastAsia="en-US" w:bidi="ar-SA"/>
+        </w:rPr>
+      </w:pPr>
+      <w:r>
+        <w:rPr>
+          <w:lang w:val="en-US" w:eastAsia="en-US" w:bidi="ar-SA"/>
+        </w:rPr>
+        <w:t>Tour management is handled by the tour List Service, and the tours are stored in a reactive BehaviourSubject list. Any changes to this list are passed to the Tour List component via the ‘tours$’ observable, which automatically updates the list view.</w:t>
+      </w:r>
+    </w:p>
+    <w:p>
+      <w:pPr>
+        <w:pStyle w:val="fhtwFlietext03Arial"/>
+        <w:rPr>
+          <w:lang w:val="en-US" w:eastAsia="en-US" w:bidi="ar-SA"/>
+        </w:rPr>
+      </w:pPr>
+      <w:r>
+        <w:rPr>
+          <w:lang w:val="en-US" w:eastAsia="en-US" w:bidi="ar-SA"/>
+        </w:rPr>
+      </w:r>
+    </w:p>
+    <w:p>
+      <w:pPr>
+        <w:pStyle w:val="fhtwFlietext03Arial"/>
+        <w:rPr>
+          <w:lang w:val="en-US" w:eastAsia="en-US" w:bidi="ar-SA"/>
+        </w:rPr>
+      </w:pPr>
+      <w:r>
+        <w:rPr>
+          <w:lang w:val="en-US" w:eastAsia="en-US" w:bidi="ar-SA"/>
+        </w:rPr>
+        <w:t xml:space="preserve">However, since the implementation of the backend </w:t>
+      </w:r>
+      <w:r>
+        <w:rPr>
+          <w:lang w:val="en-US" w:eastAsia="en-US" w:bidi="ar-SA"/>
+        </w:rPr>
+        <w:t>tour API</w:t>
+      </w:r>
+      <w:r>
+        <w:rPr>
+          <w:lang w:val="en-US" w:eastAsia="en-US" w:bidi="ar-SA"/>
+        </w:rPr>
+        <w:t xml:space="preserve">, the tours$ </w:t>
+      </w:r>
+      <w:r>
+        <w:rPr>
+          <w:lang w:val="en-US" w:eastAsia="en-US" w:bidi="ar-SA"/>
+        </w:rPr>
+        <w:t>observable</w:t>
+      </w:r>
+      <w:r>
+        <w:rPr>
+          <w:lang w:val="en-US" w:eastAsia="en-US" w:bidi="ar-SA"/>
+        </w:rPr>
+        <w:t xml:space="preserve"> is updated via asynchronous http-requests </w:t>
+      </w:r>
+      <w:r>
+        <w:rPr>
+          <w:lang w:val="en-US" w:eastAsia="en-US" w:bidi="ar-SA"/>
+        </w:rPr>
+        <w:t>to the database, which do not trigger a reload of the list view. This lead to a desynchronized interface, which only updates after the page has been interacted with.</w:t>
+      </w:r>
+    </w:p>
+    <w:p>
+      <w:pPr>
+        <w:pStyle w:val="fhtwFlietext03Arial"/>
+        <w:rPr>
+          <w:lang w:val="en-US" w:eastAsia="en-US" w:bidi="ar-SA"/>
+        </w:rPr>
+      </w:pPr>
+      <w:r>
+        <w:rPr>
+          <w:lang w:val="en-US" w:eastAsia="en-US" w:bidi="ar-SA"/>
+        </w:rPr>
+      </w:r>
+    </w:p>
+    <w:p>
+      <w:pPr>
+        <w:pStyle w:val="fhtwFlietext03Arial"/>
+        <w:rPr>
+          <w:lang w:val="en-US" w:eastAsia="en-US" w:bidi="ar-SA"/>
+        </w:rPr>
+      </w:pPr>
+      <w:r>
+        <w:rPr>
+          <w:lang w:val="en-US" w:eastAsia="en-US" w:bidi="ar-SA"/>
+        </w:rPr>
+        <w:t>To solve this issue, the component is marked for changes, which checks if the observable has changed, and then manually reloads the component.</w:t>
+      </w:r>
+    </w:p>
+    <w:p>
+      <w:pPr>
+        <w:pStyle w:val="fhtwFlietext03Arial"/>
+        <w:rPr>
+          <w:lang w:val="en-US" w:eastAsia="en-US" w:bidi="ar-SA"/>
+        </w:rPr>
+      </w:pPr>
+      <w:r>
+        <w:rPr>
+          <w:lang w:val="en-US" w:eastAsia="en-US" w:bidi="ar-SA"/>
+        </w:rPr>
+      </w:r>
+    </w:p>
+    <w:p>
+      <w:pPr>
+        <w:pStyle w:val="fhtwFlietext03Arial"/>
+        <w:rPr>
+          <w:lang w:val="en-US" w:eastAsia="en-US" w:bidi="ar-SA"/>
+        </w:rPr>
+      </w:pPr>
+      <w:r>
+        <w:rPr>
+          <w:lang w:val="en-US" w:eastAsia="en-US" w:bidi="ar-SA"/>
+        </w:rPr>
+      </w:r>
+      <w:r>
+        <mc:AlternateContent>
+          <mc:Choice Requires="wps">
+            <w:drawing>
+              <wp:anchor distT="0" distB="0" distL="0" distR="0" simplePos="0" relativeHeight="41" behindDoc="0" locked="0" layoutInCell="0" allowOverlap="1">
+                <wp:simplePos x="0" y="0"/>
+                <wp:positionH relativeFrom="column">
+                  <wp:align>center</wp:align>
+                </wp:positionH>
+                <wp:positionV relativeFrom="paragraph">
+                  <wp:posOffset>635</wp:posOffset>
+                </wp:positionV>
+                <wp:extent cx="4114800" cy="1784350"/>
+                <wp:effectExtent l="0" t="0" r="0" b="0"/>
+                <wp:wrapTopAndBottom/>
+                <wp:docPr id="16" name="Frame8"/>
+                <a:graphic xmlns:a="http://schemas.openxmlformats.org/drawingml/2006/main">
+                  <a:graphicData uri="http://schemas.microsoft.com/office/word/2010/wordprocessingShape">
+                    <wps:wsp>
+                      <wps:cNvSpPr txBox="1"/>
+                      <wps:spPr>
+                        <a:xfrm>
+                          <a:off x="0" y="0"/>
+                          <a:ext cx="4114800" cy="1784350"/>
+                        </a:xfrm>
+                        <a:prstGeom prst="rect"/>
+                        <a:solidFill>
+                          <a:srgbClr val="FFFFFF"/>
+                        </a:solidFill>
+                      </wps:spPr>
+                      <wps:txbx>
+                        <w:txbxContent>
+                          <w:p>
+                            <w:pPr>
+                              <w:pStyle w:val="Figure"/>
+                              <w:spacing w:before="0" w:after="200"/>
+                              <w:rPr>
+                                <w:lang w:val="en-US" w:eastAsia="en-US" w:bidi="ar-SA"/>
+                              </w:rPr>
+                            </w:pPr>
+                            <w:r>
+                              <w:rPr>
+                                <w:lang w:val="en-US" w:eastAsia="en-US" w:bidi="ar-SA"/>
+                              </w:rPr>
+                              <w:drawing>
+                                <wp:inline distT="0" distB="0" distL="0" distR="0">
+                                  <wp:extent cx="4114800" cy="1628775"/>
+                                  <wp:effectExtent l="0" t="0" r="0" b="0"/>
+                                  <wp:docPr id="17" name="Image5"/>
+                                  <wp:cNvGraphicFramePr>
+                                    <a:graphicFrameLocks xmlns:a="http://schemas.openxmlformats.org/drawingml/2006/main" noChangeAspect="1"/>
+                                  </wp:cNvGraphicFramePr>
+                                  <a:graphic xmlns:a="http://schemas.openxmlformats.org/drawingml/2006/main">
+                                    <a:graphicData uri="http://schemas.openxmlformats.org/drawingml/2006/picture">
+                                      <pic:pic xmlns:pic="http://schemas.openxmlformats.org/drawingml/2006/picture">
+                                        <pic:nvPicPr>
+                                          <pic:cNvPr id="17" name="Image5"/>
+                                          <pic:cNvPicPr>
+                                            <a:picLocks noChangeAspect="1" noChangeArrowheads="1"/>
+                                          </pic:cNvPicPr>
+                                        </pic:nvPicPr>
+                                        <pic:blipFill>
+                                          <a:blip r:embed="rId17"/>
+                                          <a:stretch>
+                                            <a:fillRect/>
+                                          </a:stretch>
+                                        </pic:blipFill>
+                                        <pic:spPr bwMode="auto">
+                                          <a:xfrm>
+                                            <a:off x="0" y="0"/>
+                                            <a:ext cx="4114800" cy="1628775"/>
+                                          </a:xfrm>
+                                          <a:prstGeom prst="rect">
+                                            <a:avLst/>
+                                          </a:prstGeom>
+                                          <a:noFill/>
+                                        </pic:spPr>
+                                      </pic:pic>
+                                    </a:graphicData>
+                                  </a:graphic>
+                                </wp:inline>
+                              </w:drawing>
+                              <w:t xml:space="preserve">Figure </w:t>
+                            </w:r>
+                            <w:r>
+                              <w:rPr>
+                                <w:lang w:val="en-US" w:eastAsia="en-US" w:bidi="ar-SA"/>
+                              </w:rPr>
+                              <w:fldChar w:fldCharType="begin"/>
+                            </w:r>
+                            <w:r>
+                              <w:rPr>
+                                <w:lang w:val="en-US" w:eastAsia="en-US" w:bidi="ar-SA"/>
+                              </w:rPr>
+                              <w:instrText xml:space="preserve"> SEQ Figure \* ARABIC </w:instrText>
+                            </w:r>
+                            <w:r>
+                              <w:rPr>
+                                <w:lang w:val="en-US" w:eastAsia="en-US" w:bidi="ar-SA"/>
+                              </w:rPr>
+                              <w:fldChar w:fldCharType="separate"/>
+                            </w:r>
+                            <w:r>
+                              <w:rPr>
+                                <w:lang w:val="en-US" w:eastAsia="en-US" w:bidi="ar-SA"/>
+                              </w:rPr>
+                              <w:t>5</w:t>
+                            </w:r>
+                            <w:r>
+                              <w:rPr>
+                                <w:lang w:val="en-US" w:eastAsia="en-US" w:bidi="ar-SA"/>
+                              </w:rPr>
+                              <w:fldChar w:fldCharType="end"/>
+                            </w:r>
+                            <w:r>
+                              <w:rPr>
+                                <w:lang w:val="en-US" w:eastAsia="en-US" w:bidi="ar-SA"/>
+                              </w:rPr>
+                              <w:t>: Code for manual synchronization</w:t>
+                            </w:r>
+                          </w:p>
+                        </w:txbxContent>
+                      </wps:txbx>
+                      <wps:bodyPr anchor="t" lIns="0" tIns="0" rIns="0" bIns="0">
+                        <a:noAutofit/>
+                      </wps:bodyPr>
+                    </wps:wsp>
+                  </a:graphicData>
+                </a:graphic>
+              </wp:anchor>
+            </w:drawing>
+          </mc:Choice>
+          <mc:Fallback>
+            <w:pict>
+              <v:rect style="position:absolute;rotation:-0;width:324pt;height:140.5pt;mso-wrap-distance-left:0pt;mso-wrap-distance-right:0pt;mso-wrap-distance-top:0pt;mso-wrap-distance-bottom:0pt;margin-top:0pt;mso-position-vertical:top;mso-position-vertical-relative:text;margin-left:86.65pt;mso-position-horizontal:center;mso-position-horizontal-relative:text">
+                <v:textbox inset="0in,0in,0in,0in">
+                  <w:txbxContent>
+                    <w:p>
+                      <w:pPr>
+                        <w:pStyle w:val="Figure"/>
+                        <w:spacing w:before="0" w:after="200"/>
+                        <w:rPr>
+                          <w:lang w:val="en-US" w:eastAsia="en-US" w:bidi="ar-SA"/>
+                        </w:rPr>
+                      </w:pPr>
+                      <w:r>
+                        <w:rPr>
+                          <w:lang w:val="en-US" w:eastAsia="en-US" w:bidi="ar-SA"/>
+                        </w:rPr>
+                        <w:drawing>
+                          <wp:inline distT="0" distB="0" distL="0" distR="0">
+                            <wp:extent cx="4114800" cy="1628775"/>
+                            <wp:effectExtent l="0" t="0" r="0" b="0"/>
+                            <wp:docPr id="18" name="Image5"/>
+                            <wp:cNvGraphicFramePr>
+                              <a:graphicFrameLocks xmlns:a="http://schemas.openxmlformats.org/drawingml/2006/main" noChangeAspect="1"/>
+                            </wp:cNvGraphicFramePr>
+                            <a:graphic xmlns:a="http://schemas.openxmlformats.org/drawingml/2006/main">
+                              <a:graphicData uri="http://schemas.openxmlformats.org/drawingml/2006/picture">
+                                <pic:pic xmlns:pic="http://schemas.openxmlformats.org/drawingml/2006/picture">
+                                  <pic:nvPicPr>
+                                    <pic:cNvPr id="18" name="Image5"/>
+                                    <pic:cNvPicPr>
+                                      <a:picLocks noChangeAspect="1" noChangeArrowheads="1"/>
+                                    </pic:cNvPicPr>
+                                  </pic:nvPicPr>
+                                  <pic:blipFill>
+                                    <a:blip r:embed="rId18"/>
+                                    <a:stretch>
+                                      <a:fillRect/>
+                                    </a:stretch>
+                                  </pic:blipFill>
+                                  <pic:spPr bwMode="auto">
+                                    <a:xfrm>
+                                      <a:off x="0" y="0"/>
+                                      <a:ext cx="4114800" cy="1628775"/>
+                                    </a:xfrm>
+                                    <a:prstGeom prst="rect">
+                                      <a:avLst/>
+                                    </a:prstGeom>
+                                    <a:noFill/>
+                                  </pic:spPr>
+                                </pic:pic>
+                              </a:graphicData>
+                            </a:graphic>
+                          </wp:inline>
+                        </w:drawing>
+                        <w:t xml:space="preserve">Figure </w:t>
+                      </w:r>
+                      <w:r>
+                        <w:rPr>
+                          <w:lang w:val="en-US" w:eastAsia="en-US" w:bidi="ar-SA"/>
+                        </w:rPr>
+                        <w:fldChar w:fldCharType="begin"/>
+                      </w:r>
+                      <w:r>
+                        <w:rPr>
+                          <w:lang w:val="en-US" w:eastAsia="en-US" w:bidi="ar-SA"/>
+                        </w:rPr>
+                        <w:instrText xml:space="preserve"> SEQ Figure \* ARABIC </w:instrText>
+                      </w:r>
+                      <w:r>
+                        <w:rPr>
+                          <w:lang w:val="en-US" w:eastAsia="en-US" w:bidi="ar-SA"/>
+                        </w:rPr>
+                        <w:fldChar w:fldCharType="separate"/>
+                      </w:r>
+                      <w:r>
+                        <w:rPr>
+                          <w:lang w:val="en-US" w:eastAsia="en-US" w:bidi="ar-SA"/>
+                        </w:rPr>
+                        <w:t>5</w:t>
+                      </w:r>
+                      <w:r>
+                        <w:rPr>
+                          <w:lang w:val="en-US" w:eastAsia="en-US" w:bidi="ar-SA"/>
+                        </w:rPr>
+                        <w:fldChar w:fldCharType="end"/>
+                      </w:r>
+                      <w:r>
+                        <w:rPr>
+                          <w:lang w:val="en-US" w:eastAsia="en-US" w:bidi="ar-SA"/>
+                        </w:rPr>
+                        <w:t>: Code for manual synchronization</w:t>
+                      </w:r>
+                    </w:p>
+                  </w:txbxContent>
+                </v:textbox>
+                <w10:wrap type="topAndBottom"/>
+              </v:rect>
+            </w:pict>
+          </mc:Fallback>
+        </mc:AlternateContent>
+      </w:r>
+    </w:p>
+    <w:p>
+      <w:pPr>
+        <w:pStyle w:val="fhtwberschrift05ArialBold"/>
+        <w:spacing w:before="0" w:after="240"/>
         <w:rPr>
           <w:sz w:val="28"/>
           <w:szCs w:val="28"/>
           <w:lang w:val="en-US" w:eastAsia="en-US" w:bidi="ar-SA"/>
         </w:rPr>
-        <w:t>List</w:t>
-      </w:r>
+      </w:pPr>
       <w:r>
         <w:rPr>
           <w:sz w:val="28"/>
           <w:szCs w:val="28"/>
           <w:lang w:val="en-US" w:eastAsia="en-US" w:bidi="ar-SA"/>
         </w:rPr>
-        <w:t>:</w:t>
-      </w:r>
-    </w:p>
-    <w:p>
-      <w:pPr>
-        <w:pStyle w:val="fhtwFlietext03Arial"/>
-        <w:rPr>
-          <w:lang w:val="en-US" w:eastAsia="en-US" w:bidi="ar-SA"/>
-        </w:rPr>
-      </w:pPr>
-      <w:r>
-        <w:rPr>
-          <w:lang w:val="en-US" w:eastAsia="en-US" w:bidi="ar-SA"/>
-        </w:rPr>
-        <w:t>[How the Clarity Variant was implemented]</w:t>
+        <w:t>Tour-Creation:</w:t>
+      </w:r>
+    </w:p>
+    <w:p>
+      <w:pPr>
+        <w:pStyle w:val="fhtwFlietext03Arial"/>
+        <w:rPr>
+          <w:lang w:val="en-US" w:eastAsia="en-US" w:bidi="ar-SA"/>
+        </w:rPr>
+      </w:pPr>
+      <w:r>
+        <w:rPr>
+          <w:lang w:val="en-US" w:eastAsia="en-US" w:bidi="ar-SA"/>
+        </w:rPr>
+        <w:t>The Tour Creation component provides a form for entering tour data.</w:t>
+      </w:r>
+    </w:p>
+    <w:p>
+      <w:pPr>
+        <w:pStyle w:val="fhtwFlietext03Arial"/>
+        <w:rPr>
+          <w:lang w:val="en-US" w:eastAsia="en-US" w:bidi="ar-SA"/>
+        </w:rPr>
+      </w:pPr>
+      <w:r>
+        <w:rPr>
+          <w:lang w:val="en-US" w:eastAsia="en-US" w:bidi="ar-SA"/>
+        </w:rPr>
+        <w:t>For a tour to be created, first all necessary fields have to be filled out (Title, From,To and TransportType). Then, the user has to generat</w:t>
+      </w:r>
+      <w:r>
+        <w:rPr>
+          <w:lang w:val="en-US" w:eastAsia="en-US" w:bidi="ar-SA"/>
+        </w:rPr>
+        <w:t>e</w:t>
+      </w:r>
+      <w:r>
+        <w:rPr>
+          <w:lang w:val="en-US" w:eastAsia="en-US" w:bidi="ar-SA"/>
+        </w:rPr>
+        <w:t xml:space="preserve"> the </w:t>
+      </w:r>
+      <w:r>
+        <w:rPr>
+          <w:lang w:val="en-US" w:eastAsia="en-US" w:bidi="ar-SA"/>
+        </w:rPr>
+        <w:t>route</w:t>
+      </w:r>
+      <w:r>
+        <w:rPr>
+          <w:lang w:val="en-US" w:eastAsia="en-US" w:bidi="ar-SA"/>
+        </w:rPr>
+        <w:t xml:space="preserve"> via the “generat</w:t>
+      </w:r>
+      <w:r>
+        <w:rPr>
+          <w:lang w:val="en-US" w:eastAsia="en-US" w:bidi="ar-SA"/>
+        </w:rPr>
+        <w:t>e Route”</w:t>
+      </w:r>
+      <w:r>
+        <w:rPr>
+          <w:lang w:val="en-US" w:eastAsia="en-US" w:bidi="ar-SA"/>
+        </w:rPr>
+        <w:t xml:space="preserve"> button. </w:t>
+      </w:r>
+      <w:r>
+        <w:rPr>
+          <w:lang w:val="en-US" w:eastAsia="en-US" w:bidi="ar-SA"/>
+        </w:rPr>
+        <w:t>The component sends the information of the start and destination to the ORS-Component, who packages it as a request to the backend ORS-controller, who again sends it to the Open-Route-Service API, who should respond with a geocode json containing the coordinates of the locations. When the coordinates are received another request is send out, this time with both coordinates and the transport type, which the backend controller translates to an Open-Route-Service-API direction request. The ORS-Api should, if successful, return a summary of the route, with distance and duration as well as a list of coordinates for the leaflet service to display on the map below.</w:t>
+      </w:r>
+    </w:p>
+    <w:p>
+      <w:pPr>
+        <w:pStyle w:val="fhtwFlietext03Arial"/>
+        <w:rPr>
+          <w:lang w:val="en-US" w:eastAsia="en-US" w:bidi="ar-SA"/>
+        </w:rPr>
+      </w:pPr>
+      <w:r>
+        <w:rPr>
+          <w:lang w:val="en-US" w:eastAsia="en-US" w:bidi="ar-SA"/>
+        </w:rPr>
+      </w:r>
+    </w:p>
+    <w:p>
+      <w:pPr>
+        <w:pStyle w:val="fhtwFlietext03Arial"/>
+        <w:rPr>
+          <w:lang w:val="en-US" w:eastAsia="en-US" w:bidi="ar-SA"/>
+        </w:rPr>
+      </w:pPr>
+      <w:r>
+        <w:rPr>
+          <w:lang w:val="en-US" w:eastAsia="en-US" w:bidi="ar-SA"/>
+        </w:rPr>
+        <w:t>If the route could be successfully generated, and all other necessary fields are filled out, the user can create the tour, which is then added to the list view, and is redirected to the detail view of the tour they have just created.</w:t>
       </w:r>
     </w:p>
     <w:p>
@@ -1863,7 +2456,7 @@
           <w:szCs w:val="28"/>
           <w:lang w:val="en-US" w:eastAsia="en-US" w:bidi="ar-SA"/>
         </w:rPr>
-        <w:t>Creation</w:t>
+        <w:t>Detai</w:t>
       </w:r>
       <w:r>
         <w:rPr>
@@ -1885,7 +2478,48 @@
         <w:rPr>
           <w:lang w:val="en-US" w:eastAsia="en-US" w:bidi="ar-SA"/>
         </w:rPr>
-        <w:t>[How Tours are created, Frontend edition]</w:t>
+        <w:t>The Tour-Detail shows a detailed view of a selected tour and is called via the tour list.</w:t>
+      </w:r>
+    </w:p>
+    <w:p>
+      <w:pPr>
+        <w:pStyle w:val="fhtwFlietext03Arial"/>
+        <w:rPr>
+          <w:lang w:val="en-US" w:eastAsia="en-US" w:bidi="ar-SA"/>
+        </w:rPr>
+      </w:pPr>
+      <w:r>
+        <w:rPr>
+          <w:lang w:val="en-US" w:eastAsia="en-US" w:bidi="ar-SA"/>
+        </w:rPr>
+      </w:r>
+    </w:p>
+    <w:p>
+      <w:pPr>
+        <w:pStyle w:val="fhtwFlietext03Arial"/>
+        <w:rPr>
+          <w:lang w:val="en-US" w:eastAsia="en-US" w:bidi="ar-SA"/>
+        </w:rPr>
+      </w:pPr>
+      <w:r>
+        <w:rPr>
+          <w:lang w:val="en-US" w:eastAsia="en-US" w:bidi="ar-SA"/>
+        </w:rPr>
+        <w:t>It receives the current tour information from the shell via an input property and displays the available tour data as well as a preview of the associated logs. User actions such as editing, deleting or viewing all logs are passed to the shell via output events.</w:t>
+      </w:r>
+    </w:p>
+    <w:p>
+      <w:pPr>
+        <w:pStyle w:val="fhtwFlietext03Arial"/>
+        <w:rPr>
+          <w:lang w:val="en-US" w:eastAsia="en-US" w:bidi="ar-SA"/>
+        </w:rPr>
+      </w:pPr>
+      <w:r>
+        <w:rPr>
+          <w:lang w:val="en-US" w:eastAsia="en-US" w:bidi="ar-SA"/>
+        </w:rPr>
+        <w:t>The shell handles the state changes and controls the subsequent UI mode. The component itself contains no business logic and serves solely for display and event forwarding.</w:t>
       </w:r>
     </w:p>
     <w:p>
@@ -1917,29 +2551,83 @@
           <w:szCs w:val="28"/>
           <w:lang w:val="en-US" w:eastAsia="en-US" w:bidi="ar-SA"/>
         </w:rPr>
-        <w:t>Tour-</w:t>
-      </w:r>
-      <w:r>
+        <w:t>Tour-Edit and -Delete:</w:t>
+      </w:r>
+    </w:p>
+    <w:p>
+      <w:pPr>
+        <w:pStyle w:val="fhtwFlietext03Arial"/>
+        <w:rPr>
+          <w:lang w:val="en-US" w:eastAsia="en-US" w:bidi="ar-SA"/>
+        </w:rPr>
+      </w:pPr>
+      <w:r>
+        <w:rPr>
+          <w:lang w:val="en-US" w:eastAsia="en-US" w:bidi="ar-SA"/>
+        </w:rPr>
+        <w:t>The Tour Edit component allows the user to edit an existing tour.</w:t>
+      </w:r>
+    </w:p>
+    <w:p>
+      <w:pPr>
+        <w:pStyle w:val="fhtwFlietext03Arial"/>
+        <w:rPr>
+          <w:lang w:val="en-US" w:eastAsia="en-US" w:bidi="ar-SA"/>
+        </w:rPr>
+      </w:pPr>
+      <w:r>
+        <w:rPr>
+          <w:lang w:val="en-US" w:eastAsia="en-US" w:bidi="ar-SA"/>
+        </w:rPr>
+        <w:t>When opened, the selected tour is passed via an input property and imported into a local model, so changes are initially only made locally. Upon saving, the component sends an event with the updated data to the shell, which calls the tour-service to update the respective tour in the repository by sending a request to the backend api.</w:t>
+        <w:br/>
+        <w:t>Deleting a tour is triggered from the details view and also reported to the shell via an event. The shell removes the tour from the central list using the tour list service, which also calls the tour-service to remove the tour from the repository. The list is then reloaded by receiving all remaining entries of the repository which prompts the tour-list to update it’s entries.</w:t>
+      </w:r>
+    </w:p>
+    <w:p>
+      <w:pPr>
+        <w:pStyle w:val="fhtwFlietext03Arial"/>
+        <w:rPr>
+          <w:lang w:val="en-US" w:eastAsia="en-US" w:bidi="ar-SA"/>
+        </w:rPr>
+      </w:pPr>
+      <w:r>
+        <w:rPr>
+          <w:lang w:val="en-US" w:eastAsia="en-US" w:bidi="ar-SA"/>
+        </w:rPr>
+      </w:r>
+    </w:p>
+    <w:p>
+      <w:pPr>
+        <w:pStyle w:val="fhtwberschrift05ArialBold"/>
+        <w:spacing w:before="0" w:after="240"/>
         <w:rPr>
           <w:sz w:val="28"/>
           <w:szCs w:val="28"/>
           <w:lang w:val="en-US" w:eastAsia="en-US" w:bidi="ar-SA"/>
         </w:rPr>
-        <w:t>View:</w:t>
-      </w:r>
-    </w:p>
-    <w:p>
-      <w:pPr>
-        <w:pStyle w:val="fhtwFlietext03Arial"/>
-        <w:rPr>
-          <w:lang w:val="en-US" w:eastAsia="en-US" w:bidi="ar-SA"/>
-        </w:rPr>
-      </w:pPr>
-      <w:r>
-        <w:rPr>
-          <w:lang w:val="en-US" w:eastAsia="en-US" w:bidi="ar-SA"/>
-        </w:rPr>
-        <w:t>[What information is displayed]</w:t>
+      </w:pPr>
+      <w:r>
+        <w:rPr>
+          <w:sz w:val="28"/>
+          <w:szCs w:val="28"/>
+          <w:lang w:val="en-US" w:eastAsia="en-US" w:bidi="ar-SA"/>
+        </w:rPr>
+        <w:t>Tour-Log-List:</w:t>
+      </w:r>
+    </w:p>
+    <w:p>
+      <w:pPr>
+        <w:pStyle w:val="fhtwFlietext03Arial"/>
+        <w:rPr>
+          <w:lang w:val="en-US" w:eastAsia="en-US" w:bidi="ar-SA"/>
+        </w:rPr>
+      </w:pPr>
+      <w:r>
+        <w:rPr>
+          <w:lang w:val="en-US" w:eastAsia="en-US" w:bidi="ar-SA"/>
+        </w:rPr>
+        <w:t>[How the tour-logs are displayed] [How the list can be accessed]</w:t>
       </w:r>
     </w:p>
     <w:p>
@@ -1971,29 +2659,67 @@
           <w:szCs w:val="28"/>
           <w:lang w:val="en-US" w:eastAsia="en-US" w:bidi="ar-SA"/>
         </w:rPr>
-        <w:t>Tour-Edit and -Delete</w:t>
-      </w:r>
-      <w:r>
+        <w:t>Tour-Log-Create:</w:t>
+      </w:r>
+    </w:p>
+    <w:p>
+      <w:pPr>
+        <w:pStyle w:val="fhtwFlietext03Arial"/>
+        <w:rPr>
+          <w:lang w:val="en-US" w:eastAsia="en-US" w:bidi="ar-SA"/>
+        </w:rPr>
+      </w:pPr>
+      <w:r>
+        <w:rPr>
+          <w:lang w:val="en-US" w:eastAsia="en-US" w:bidi="ar-SA"/>
+        </w:rPr>
+        <w:t>[How tour logs are created]</w:t>
+      </w:r>
+    </w:p>
+    <w:p>
+      <w:pPr>
+        <w:pStyle w:val="fhtwFlietext03Arial"/>
+        <w:rPr>
+          <w:lang w:val="en-US" w:eastAsia="en-US" w:bidi="ar-SA"/>
+        </w:rPr>
+      </w:pPr>
+      <w:r>
+        <w:rPr>
+          <w:lang w:val="en-US" w:eastAsia="en-US" w:bidi="ar-SA"/>
+        </w:rPr>
+      </w:r>
+    </w:p>
+    <w:p>
+      <w:pPr>
+        <w:pStyle w:val="fhtwberschrift05ArialBold"/>
+        <w:spacing w:before="0" w:after="240"/>
         <w:rPr>
           <w:sz w:val="28"/>
           <w:szCs w:val="28"/>
           <w:lang w:val="en-US" w:eastAsia="en-US" w:bidi="ar-SA"/>
         </w:rPr>
-        <w:t>:</w:t>
-      </w:r>
-    </w:p>
-    <w:p>
-      <w:pPr>
-        <w:pStyle w:val="fhtwFlietext03Arial"/>
-        <w:rPr>
-          <w:lang w:val="en-US" w:eastAsia="en-US" w:bidi="ar-SA"/>
-        </w:rPr>
-      </w:pPr>
-      <w:r>
-        <w:rPr>
-          <w:lang w:val="en-US" w:eastAsia="en-US" w:bidi="ar-SA"/>
-        </w:rPr>
-        <w:t>[How editing a tour works] [how it gets deleted]</w:t>
+      </w:pPr>
+      <w:r>
+        <w:rPr>
+          <w:sz w:val="28"/>
+          <w:szCs w:val="28"/>
+          <w:lang w:val="en-US" w:eastAsia="en-US" w:bidi="ar-SA"/>
+        </w:rPr>
+        <w:t>Tour-Log-View:</w:t>
+      </w:r>
+    </w:p>
+    <w:p>
+      <w:pPr>
+        <w:pStyle w:val="fhtwFlietext03Arial"/>
+        <w:rPr>
+          <w:lang w:val="en-US" w:eastAsia="en-US" w:bidi="ar-SA"/>
+        </w:rPr>
+      </w:pPr>
+      <w:r>
+        <w:rPr>
+          <w:lang w:val="en-US" w:eastAsia="en-US" w:bidi="ar-SA"/>
+        </w:rPr>
+        <w:t>[What is displayed]</w:t>
       </w:r>
     </w:p>
     <w:p>
@@ -2025,29 +2751,207 @@
           <w:szCs w:val="28"/>
           <w:lang w:val="en-US" w:eastAsia="en-US" w:bidi="ar-SA"/>
         </w:rPr>
-        <w:t>Tour-Log-List</w:t>
-      </w:r>
-      <w:r>
+        <w:t>Tour-Log-Edit and -Delete:</w:t>
+      </w:r>
+    </w:p>
+    <w:p>
+      <w:pPr>
+        <w:pStyle w:val="fhtwFlietext03Arial"/>
+        <w:rPr>
+          <w:lang w:val="en-US" w:eastAsia="en-US" w:bidi="ar-SA"/>
+        </w:rPr>
+      </w:pPr>
+      <w:r>
+        <w:rPr>
+          <w:lang w:val="en-US" w:eastAsia="en-US" w:bidi="ar-SA"/>
+        </w:rPr>
+        <w:t>[same as tour]</w:t>
+      </w:r>
+    </w:p>
+    <w:p>
+      <w:pPr>
+        <w:pStyle w:val="fhtwFlietext03Arial"/>
+        <w:rPr>
+          <w:lang w:val="en-US" w:eastAsia="en-US" w:bidi="ar-SA"/>
+        </w:rPr>
+      </w:pPr>
+      <w:r>
+        <w:rPr>
+          <w:lang w:val="en-US" w:eastAsia="en-US" w:bidi="ar-SA"/>
+        </w:rPr>
+      </w:r>
+    </w:p>
+    <w:p>
+      <w:pPr>
+        <w:pStyle w:val="fhtwberschrift06Arialbold"/>
+        <w:rPr>
+          <w:sz w:val="32"/>
+          <w:szCs w:val="32"/>
+          <w:lang w:val="en-US" w:eastAsia="en-US" w:bidi="ar-SA"/>
+        </w:rPr>
+      </w:pPr>
+      <w:r>
+        <w:rPr>
+          <w:sz w:val="32"/>
+          <w:szCs w:val="32"/>
+          <w:lang w:val="en-US" w:eastAsia="en-US" w:bidi="ar-SA"/>
+        </w:rPr>
+        <w:t>Services:</w:t>
+      </w:r>
+    </w:p>
+    <w:p>
+      <w:pPr>
+        <w:pStyle w:val="fhtwberschrift05ArialBold"/>
+        <w:spacing w:before="0" w:after="240"/>
         <w:rPr>
           <w:sz w:val="28"/>
           <w:szCs w:val="28"/>
           <w:lang w:val="en-US" w:eastAsia="en-US" w:bidi="ar-SA"/>
         </w:rPr>
-        <w:t>:</w:t>
-      </w:r>
-    </w:p>
-    <w:p>
-      <w:pPr>
-        <w:pStyle w:val="fhtwFlietext03Arial"/>
-        <w:rPr>
-          <w:lang w:val="en-US" w:eastAsia="en-US" w:bidi="ar-SA"/>
-        </w:rPr>
-      </w:pPr>
-      <w:r>
-        <w:rPr>
-          <w:lang w:val="en-US" w:eastAsia="en-US" w:bidi="ar-SA"/>
-        </w:rPr>
-        <w:t>[How the tour-logs are displayed] [How the list can be accessed]</w:t>
+      </w:pPr>
+      <w:r>
+        <w:rPr>
+          <w:sz w:val="28"/>
+          <w:szCs w:val="28"/>
+          <w:lang w:val="en-US" w:eastAsia="en-US" w:bidi="ar-SA"/>
+        </w:rPr>
+        <w:t>Tour-Service:</w:t>
+      </w:r>
+    </w:p>
+    <w:p>
+      <w:pPr>
+        <w:pStyle w:val="fhtwFlietext03Arial"/>
+        <w:rPr>
+          <w:lang w:val="en-US" w:eastAsia="en-US" w:bidi="ar-SA"/>
+        </w:rPr>
+      </w:pPr>
+      <w:r>
+        <w:rPr>
+          <w:lang w:val="en-US" w:eastAsia="en-US" w:bidi="ar-SA"/>
+        </w:rPr>
+        <w:t>The tour-service has the Responsibility to communicating with the tour API via http requests. It is only called by the tour-list-service and has the following functions:</w:t>
+      </w:r>
+    </w:p>
+    <w:p>
+      <w:pPr>
+        <w:pStyle w:val="fhtwFlietext03Arial"/>
+        <w:numPr>
+          <w:ilvl w:val="0"/>
+          <w:numId w:val="1"/>
+        </w:numPr>
+        <w:rPr>
+          <w:lang w:val="en-US" w:eastAsia="en-US" w:bidi="ar-SA"/>
+        </w:rPr>
+      </w:pPr>
+      <w:r>
+        <w:rPr>
+          <w:lang w:val="en-US" w:eastAsia="en-US" w:bidi="ar-SA"/>
+        </w:rPr>
+        <w:t>getAllTours(query?: string) → Returns all tours which are optionally fitered with a query string.</w:t>
+      </w:r>
+    </w:p>
+    <w:p>
+      <w:pPr>
+        <w:pStyle w:val="fhtwFlietext03Arial"/>
+        <w:numPr>
+          <w:ilvl w:val="0"/>
+          <w:numId w:val="1"/>
+        </w:numPr>
+        <w:rPr>
+          <w:lang w:val="en-US" w:eastAsia="en-US" w:bidi="ar-SA"/>
+        </w:rPr>
+      </w:pPr>
+      <w:r>
+        <w:rPr>
+          <w:lang w:val="en-US" w:eastAsia="en-US" w:bidi="ar-SA"/>
+        </w:rPr>
+        <w:t>getTour(id: string) → Returns a tour by their Id</w:t>
+      </w:r>
+    </w:p>
+    <w:p>
+      <w:pPr>
+        <w:pStyle w:val="fhtwFlietext03Arial"/>
+        <w:numPr>
+          <w:ilvl w:val="0"/>
+          <w:numId w:val="1"/>
+        </w:numPr>
+        <w:rPr>
+          <w:lang w:val="en-US" w:eastAsia="en-US" w:bidi="ar-SA"/>
+        </w:rPr>
+      </w:pPr>
+      <w:r>
+        <w:rPr>
+          <w:lang w:val="en-US" w:eastAsia="en-US" w:bidi="ar-SA"/>
+        </w:rPr>
+        <w:t>createTour → createTour(tour: TourItemInterface) → creates a new Tour and returns the tour received by the response</w:t>
+      </w:r>
+    </w:p>
+    <w:p>
+      <w:pPr>
+        <w:pStyle w:val="fhtwFlietext03Arial"/>
+        <w:numPr>
+          <w:ilvl w:val="0"/>
+          <w:numId w:val="1"/>
+        </w:numPr>
+        <w:rPr>
+          <w:lang w:val="en-US" w:eastAsia="en-US" w:bidi="ar-SA"/>
+        </w:rPr>
+      </w:pPr>
+      <w:r>
+        <w:rPr>
+          <w:lang w:val="en-US" w:eastAsia="en-US" w:bidi="ar-SA"/>
+        </w:rPr>
+        <w:t>updateTour(id: string, tour: TourItemInterface) → updates an existing tour</w:t>
+      </w:r>
+    </w:p>
+    <w:p>
+      <w:pPr>
+        <w:pStyle w:val="fhtwFlietext03Arial"/>
+        <w:numPr>
+          <w:ilvl w:val="0"/>
+          <w:numId w:val="1"/>
+        </w:numPr>
+        <w:rPr>
+          <w:lang w:val="en-US" w:eastAsia="en-US" w:bidi="ar-SA"/>
+        </w:rPr>
+      </w:pPr>
+      <w:r>
+        <w:rPr>
+          <w:lang w:val="en-US" w:eastAsia="en-US" w:bidi="ar-SA"/>
+        </w:rPr>
+        <w:t>deleteTour(id: string) → deletes a tour</w:t>
+      </w:r>
+    </w:p>
+    <w:p>
+      <w:pPr>
+        <w:pStyle w:val="fhtwFlietext03Arial"/>
+        <w:numPr>
+          <w:ilvl w:val="0"/>
+          <w:numId w:val="0"/>
+        </w:numPr>
+        <w:ind w:hanging="0" w:start="153"/>
+        <w:rPr>
+          <w:lang w:val="en-US" w:eastAsia="en-US" w:bidi="ar-SA"/>
+        </w:rPr>
+      </w:pPr>
+      <w:r>
+        <w:rPr>
+          <w:lang w:val="en-US" w:eastAsia="en-US" w:bidi="ar-SA"/>
+        </w:rPr>
+      </w:r>
+    </w:p>
+    <w:p>
+      <w:pPr>
+        <w:pStyle w:val="fhtwFlietext03Arial"/>
+        <w:rPr>
+          <w:lang w:val="en-US" w:eastAsia="en-US" w:bidi="ar-SA"/>
+        </w:rPr>
+      </w:pPr>
+      <w:r>
+        <w:rPr>
+          <w:lang w:val="en-US" w:eastAsia="en-US" w:bidi="ar-SA"/>
+        </w:rPr>
+        <w:t>The http requests all start with the same base URL which gets modified for the specific requests.</w:t>
       </w:r>
     </w:p>
     <w:p>
@@ -2079,357 +2983,177 @@
           <w:szCs w:val="28"/>
           <w:lang w:val="en-US" w:eastAsia="en-US" w:bidi="ar-SA"/>
         </w:rPr>
-        <w:t>Tour-Log-</w:t>
-      </w:r>
-      <w:r>
-        <w:rPr>
-          <w:sz w:val="28"/>
-          <w:szCs w:val="28"/>
-          <w:lang w:val="en-US" w:eastAsia="en-US" w:bidi="ar-SA"/>
-        </w:rPr>
-        <w:t>Create</w:t>
-      </w:r>
-      <w:r>
-        <w:rPr>
-          <w:sz w:val="28"/>
-          <w:szCs w:val="28"/>
-          <w:lang w:val="en-US" w:eastAsia="en-US" w:bidi="ar-SA"/>
-        </w:rPr>
-        <w:t>:</w:t>
-      </w:r>
-    </w:p>
-    <w:p>
-      <w:pPr>
-        <w:pStyle w:val="fhtwFlietext03Arial"/>
-        <w:rPr>
-          <w:lang w:val="en-US" w:eastAsia="en-US" w:bidi="ar-SA"/>
-        </w:rPr>
-      </w:pPr>
-      <w:r>
-        <w:rPr>
-          <w:lang w:val="en-US" w:eastAsia="en-US" w:bidi="ar-SA"/>
-        </w:rPr>
-        <w:t>[How tour logs are created]</w:t>
-      </w:r>
-    </w:p>
-    <w:p>
-      <w:pPr>
-        <w:pStyle w:val="fhtwFlietext03Arial"/>
-        <w:rPr>
-          <w:lang w:val="en-US" w:eastAsia="en-US" w:bidi="ar-SA"/>
-        </w:rPr>
-      </w:pPr>
-      <w:r>
-        <w:rPr>
-          <w:lang w:val="en-US" w:eastAsia="en-US" w:bidi="ar-SA"/>
-        </w:rPr>
-      </w:r>
-    </w:p>
-    <w:p>
-      <w:pPr>
-        <w:pStyle w:val="fhtwberschrift05ArialBold"/>
-        <w:spacing w:before="0" w:after="240"/>
-        <w:rPr>
-          <w:sz w:val="28"/>
-          <w:szCs w:val="28"/>
-          <w:lang w:val="en-US" w:eastAsia="en-US" w:bidi="ar-SA"/>
-        </w:rPr>
-      </w:pPr>
-      <w:r>
-        <w:rPr>
-          <w:sz w:val="28"/>
-          <w:szCs w:val="28"/>
-          <w:lang w:val="en-US" w:eastAsia="en-US" w:bidi="ar-SA"/>
-        </w:rPr>
-        <w:t>Tour-Log-View</w:t>
-      </w:r>
-      <w:r>
-        <w:rPr>
-          <w:sz w:val="28"/>
-          <w:szCs w:val="28"/>
-          <w:lang w:val="en-US" w:eastAsia="en-US" w:bidi="ar-SA"/>
-        </w:rPr>
-        <w:t>:</w:t>
-      </w:r>
-    </w:p>
-    <w:p>
-      <w:pPr>
-        <w:pStyle w:val="fhtwFlietext03Arial"/>
-        <w:rPr>
-          <w:lang w:val="en-US" w:eastAsia="en-US" w:bidi="ar-SA"/>
-        </w:rPr>
-      </w:pPr>
-      <w:r>
-        <w:rPr>
-          <w:lang w:val="en-US" w:eastAsia="en-US" w:bidi="ar-SA"/>
-        </w:rPr>
-        <w:t>[What is displayed]</w:t>
-      </w:r>
-    </w:p>
-    <w:p>
-      <w:pPr>
-        <w:pStyle w:val="fhtwFlietext03Arial"/>
-        <w:rPr>
-          <w:lang w:val="en-US" w:eastAsia="en-US" w:bidi="ar-SA"/>
-        </w:rPr>
-      </w:pPr>
-      <w:r>
-        <w:rPr>
-          <w:lang w:val="en-US" w:eastAsia="en-US" w:bidi="ar-SA"/>
-        </w:rPr>
-      </w:r>
-    </w:p>
-    <w:p>
-      <w:pPr>
-        <w:pStyle w:val="fhtwberschrift05ArialBold"/>
-        <w:spacing w:before="0" w:after="240"/>
-        <w:rPr>
-          <w:sz w:val="28"/>
-          <w:szCs w:val="28"/>
-          <w:lang w:val="en-US" w:eastAsia="en-US" w:bidi="ar-SA"/>
-        </w:rPr>
-      </w:pPr>
-      <w:r>
-        <w:rPr>
-          <w:sz w:val="28"/>
-          <w:szCs w:val="28"/>
-          <w:lang w:val="en-US" w:eastAsia="en-US" w:bidi="ar-SA"/>
-        </w:rPr>
-        <w:t>Tour-Log-Edit and -Delete</w:t>
-      </w:r>
-      <w:r>
-        <w:rPr>
-          <w:sz w:val="28"/>
-          <w:szCs w:val="28"/>
-          <w:lang w:val="en-US" w:eastAsia="en-US" w:bidi="ar-SA"/>
-        </w:rPr>
-        <w:t>:</w:t>
-      </w:r>
-    </w:p>
-    <w:p>
-      <w:pPr>
-        <w:pStyle w:val="fhtwFlietext03Arial"/>
-        <w:rPr>
-          <w:lang w:val="en-US" w:eastAsia="en-US" w:bidi="ar-SA"/>
-        </w:rPr>
-      </w:pPr>
-      <w:r>
-        <w:rPr>
-          <w:lang w:val="en-US" w:eastAsia="en-US" w:bidi="ar-SA"/>
-        </w:rPr>
-        <w:t>[same as tour]</w:t>
-      </w:r>
-    </w:p>
-    <w:p>
-      <w:pPr>
-        <w:pStyle w:val="fhtwFlietext03Arial"/>
-        <w:rPr>
-          <w:lang w:val="en-US" w:eastAsia="en-US" w:bidi="ar-SA"/>
-        </w:rPr>
-      </w:pPr>
-      <w:r>
-        <w:rPr>
-          <w:lang w:val="en-US" w:eastAsia="en-US" w:bidi="ar-SA"/>
-        </w:rPr>
+        <w:t>Open-Route-Service:</w:t>
+      </w:r>
+    </w:p>
+    <w:p>
+      <w:pPr>
+        <w:pStyle w:val="fhtwFlietext03Arial"/>
+        <w:rPr>
+          <w:lang w:val="en-US" w:eastAsia="en-US" w:bidi="ar-SA"/>
+        </w:rPr>
+      </w:pPr>
+      <w:r>
+        <w:rPr>
+          <w:lang w:val="en-US" w:eastAsia="en-US" w:bidi="ar-SA"/>
+        </w:rPr>
+        <w:t>The open-route-service has the Responsibility to communicate with the ORS Api of the backend.</w:t>
+      </w:r>
+    </w:p>
+    <w:p>
+      <w:pPr>
+        <w:pStyle w:val="fhtwFlietext03Arial"/>
+        <w:rPr>
+          <w:lang w:val="en-US" w:eastAsia="en-US" w:bidi="ar-SA"/>
+        </w:rPr>
+      </w:pPr>
+      <w:r>
+        <w:rPr>
+          <w:lang w:val="en-US" w:eastAsia="en-US" w:bidi="ar-SA"/>
+        </w:rPr>
+        <w:t>It is called by the tour creation and tour edit component for requests regarding the coordinates and tour information.</w:t>
+      </w:r>
+    </w:p>
+    <w:p>
+      <w:pPr>
+        <w:pStyle w:val="fhtwFlietext03Arial"/>
+        <w:rPr>
+          <w:lang w:val="en-US" w:eastAsia="en-US" w:bidi="ar-SA"/>
+        </w:rPr>
+      </w:pPr>
+      <w:r>
+        <w:rPr>
+          <w:lang w:val="en-US" w:eastAsia="en-US" w:bidi="ar-SA"/>
+        </w:rPr>
+        <w:t>They call the following funcitons:</w:t>
+      </w:r>
+    </w:p>
+    <w:p>
+      <w:pPr>
+        <w:pStyle w:val="fhtwFlietext03Arial"/>
+        <w:numPr>
+          <w:ilvl w:val="0"/>
+          <w:numId w:val="2"/>
+        </w:numPr>
+        <w:rPr>
+          <w:lang w:val="en-US" w:eastAsia="en-US" w:bidi="ar-SA"/>
+        </w:rPr>
+      </w:pPr>
+      <w:r>
+        <w:rPr>
+          <w:lang w:val="en-US" w:eastAsia="en-US" w:bidi="ar-SA"/>
+        </w:rPr>
+        <w:t>GetCoordinatesOfPlace(value: string) → Returns a coordinates-interface which consists of a decimal longitute and latitude value</w:t>
+      </w:r>
+    </w:p>
+    <w:p>
+      <w:pPr>
+        <w:pStyle w:val="fhtwFlietext03Arial"/>
+        <w:numPr>
+          <w:ilvl w:val="0"/>
+          <w:numId w:val="2"/>
+        </w:numPr>
+        <w:rPr>
+          <w:lang w:val="en-US" w:eastAsia="en-US" w:bidi="ar-SA"/>
+        </w:rPr>
+      </w:pPr>
+      <w:r>
+        <w:rPr>
+          <w:lang w:val="en-US" w:eastAsia="en-US" w:bidi="ar-SA"/>
+        </w:rPr>
+        <w:t>GetRouteInformation(request: ORServiceRequestDto) → Returns a routeinformation-interface which consists of two decimals for the distance and duration and a list of coordinates for the route.</w:t>
+      </w:r>
+    </w:p>
+    <w:p>
+      <w:pPr>
+        <w:pStyle w:val="fhtwFlietext03Arial"/>
+        <w:rPr>
+          <w:lang w:val="en-US" w:eastAsia="en-US" w:bidi="ar-SA"/>
+        </w:rPr>
+      </w:pPr>
+      <w:r>
+        <w:rPr>
+          <w:lang w:val="en-US" w:eastAsia="en-US" w:bidi="ar-SA"/>
+        </w:rPr>
+        <w:t>The ORServiceRequestDto is an interface specifically designed for the backend API and contains the two coordinates for start and destination aswell as the transport type.</w:t>
+      </w:r>
+      <w:r>
+        <w:br w:type="page"/>
       </w:r>
     </w:p>
     <w:p>
       <w:pPr>
         <w:pStyle w:val="fhtwberschrift06Arialbold"/>
+        <w:spacing w:before="0" w:after="0"/>
+        <w:rPr>
+          <w:sz w:val="36"/>
+          <w:szCs w:val="36"/>
+          <w:lang w:val="en-US" w:eastAsia="en-US" w:bidi="ar-SA"/>
+        </w:rPr>
+      </w:pPr>
+      <w:r>
+        <w:rPr>
+          <w:sz w:val="36"/>
+          <w:szCs w:val="36"/>
+          <w:lang w:val="en-US" w:eastAsia="en-US" w:bidi="ar-SA"/>
+        </w:rPr>
+        <w:t>Backend:</w:t>
+      </w:r>
+    </w:p>
+    <w:p>
+      <w:pPr>
+        <w:pStyle w:val="fhtwFlietext03Arial"/>
+        <w:rPr>
+          <w:lang w:val="en-US" w:eastAsia="en-US" w:bidi="ar-SA"/>
+        </w:rPr>
+      </w:pPr>
+      <w:r>
+        <w:rPr>
+          <w:lang w:val="en-US" w:eastAsia="en-US" w:bidi="ar-SA"/>
+        </w:rPr>
+      </w:r>
+    </w:p>
+    <w:p>
+      <w:pPr>
+        <w:pStyle w:val="fhtwFlietext03Arial"/>
+        <w:rPr>
+          <w:lang w:val="en-US" w:eastAsia="en-US" w:bidi="ar-SA"/>
+        </w:rPr>
+      </w:pPr>
+      <w:r>
+        <w:rPr>
+          <w:lang w:val="en-US" w:eastAsia="en-US" w:bidi="ar-SA"/>
+        </w:rPr>
+        <w:t>[ASP.Net] Summary</w:t>
+      </w:r>
+    </w:p>
+    <w:p>
+      <w:pPr>
+        <w:pStyle w:val="fhtwFlietext03Arial"/>
+        <w:rPr>
+          <w:lang w:val="en-US" w:eastAsia="en-US" w:bidi="ar-SA"/>
+        </w:rPr>
+      </w:pPr>
+      <w:r>
+        <w:rPr>
+          <w:lang w:val="en-US" w:eastAsia="en-US" w:bidi="ar-SA"/>
+        </w:rPr>
+      </w:r>
+    </w:p>
+    <w:p>
+      <w:pPr>
+        <w:pStyle w:val="fhtwberschrift06Arialbold"/>
+        <w:rPr>
+          <w:lang w:val="en-US" w:eastAsia="en-US" w:bidi="ar-SA"/>
+        </w:rPr>
+      </w:pPr>
+      <w:r>
         <w:rPr>
           <w:sz w:val="32"/>
           <w:szCs w:val="32"/>
           <w:lang w:val="en-US" w:eastAsia="en-US" w:bidi="ar-SA"/>
         </w:rPr>
-      </w:pPr>
-      <w:r>
-        <w:rPr>
-          <w:sz w:val="32"/>
-          <w:szCs w:val="32"/>
-          <w:lang w:val="en-US" w:eastAsia="en-US" w:bidi="ar-SA"/>
-        </w:rPr>
-        <w:t>Services:</w:t>
-      </w:r>
-    </w:p>
-    <w:p>
-      <w:pPr>
-        <w:pStyle w:val="fhtwberschrift05ArialBold"/>
-        <w:spacing w:before="0" w:after="240"/>
-        <w:rPr>
-          <w:sz w:val="28"/>
-          <w:szCs w:val="28"/>
-          <w:lang w:val="en-US" w:eastAsia="en-US" w:bidi="ar-SA"/>
-        </w:rPr>
-      </w:pPr>
-      <w:r>
-        <w:rPr>
-          <w:sz w:val="28"/>
-          <w:szCs w:val="28"/>
-          <w:lang w:val="en-US" w:eastAsia="en-US" w:bidi="ar-SA"/>
-        </w:rPr>
-        <w:t>Tour-</w:t>
-      </w:r>
-      <w:r>
-        <w:rPr>
-          <w:sz w:val="28"/>
-          <w:szCs w:val="28"/>
-          <w:lang w:val="en-US" w:eastAsia="en-US" w:bidi="ar-SA"/>
-        </w:rPr>
-        <w:t>Service:</w:t>
-      </w:r>
-    </w:p>
-    <w:p>
-      <w:pPr>
-        <w:pStyle w:val="fhtwFlietext03Arial"/>
-        <w:rPr>
-          <w:lang w:val="en-US" w:eastAsia="en-US" w:bidi="ar-SA"/>
-        </w:rPr>
-      </w:pPr>
-      <w:r>
-        <w:rPr>
-          <w:lang w:val="en-US" w:eastAsia="en-US" w:bidi="ar-SA"/>
-        </w:rPr>
-        <w:t>[How the frontend communicates with the backend]</w:t>
-      </w:r>
-    </w:p>
-    <w:p>
-      <w:pPr>
-        <w:pStyle w:val="fhtwFlietext03Arial"/>
-        <w:rPr>
-          <w:lang w:val="en-US" w:eastAsia="en-US" w:bidi="ar-SA"/>
-        </w:rPr>
-      </w:pPr>
-      <w:r>
-        <w:rPr>
-          <w:lang w:val="en-US" w:eastAsia="en-US" w:bidi="ar-SA"/>
-        </w:rPr>
-      </w:r>
-    </w:p>
-    <w:p>
-      <w:pPr>
-        <w:pStyle w:val="fhtwberschrift05ArialBold"/>
-        <w:spacing w:before="0" w:after="240"/>
-        <w:rPr>
-          <w:sz w:val="28"/>
-          <w:szCs w:val="28"/>
-          <w:lang w:val="en-US" w:eastAsia="en-US" w:bidi="ar-SA"/>
-        </w:rPr>
-      </w:pPr>
-      <w:r>
-        <w:rPr>
-          <w:sz w:val="28"/>
-          <w:szCs w:val="28"/>
-          <w:lang w:val="en-US" w:eastAsia="en-US" w:bidi="ar-SA"/>
-        </w:rPr>
-        <w:t>Open-Route-Service</w:t>
-      </w:r>
-      <w:r>
-        <w:rPr>
-          <w:sz w:val="28"/>
-          <w:szCs w:val="28"/>
-          <w:lang w:val="en-US" w:eastAsia="en-US" w:bidi="ar-SA"/>
-        </w:rPr>
-        <w:t>:</w:t>
-      </w:r>
-    </w:p>
-    <w:p>
-      <w:pPr>
-        <w:pStyle w:val="fhtwFlietext03Arial"/>
-        <w:rPr>
-          <w:lang w:val="en-US" w:eastAsia="en-US" w:bidi="ar-SA"/>
-        </w:rPr>
-      </w:pPr>
-      <w:r>
-        <w:rPr>
-          <w:lang w:val="en-US" w:eastAsia="en-US" w:bidi="ar-SA"/>
-        </w:rPr>
-        <w:t>[how the frontend gets the route information]</w:t>
-      </w:r>
-      <w:r>
-        <w:br w:type="page"/>
-      </w:r>
-    </w:p>
-    <w:p>
-      <w:pPr>
-        <w:pStyle w:val="fhtwberschrift06Arialbold"/>
-        <w:spacing w:before="0" w:after="0"/>
-        <w:rPr>
-          <w:sz w:val="36"/>
-          <w:szCs w:val="36"/>
-          <w:lang w:val="en-US" w:eastAsia="en-US" w:bidi="ar-SA"/>
-        </w:rPr>
-      </w:pPr>
-      <w:r>
-        <w:rPr>
-          <w:sz w:val="36"/>
-          <w:szCs w:val="36"/>
-          <w:lang w:val="en-US" w:eastAsia="en-US" w:bidi="ar-SA"/>
-        </w:rPr>
-        <w:t>Backend:</w:t>
-      </w:r>
-    </w:p>
-    <w:p>
-      <w:pPr>
-        <w:pStyle w:val="fhtwFlietext03Arial"/>
-        <w:rPr>
-          <w:lang w:val="en-US" w:eastAsia="en-US" w:bidi="ar-SA"/>
-        </w:rPr>
-      </w:pPr>
-      <w:r>
-        <w:rPr>
-          <w:lang w:val="en-US" w:eastAsia="en-US" w:bidi="ar-SA"/>
-        </w:rPr>
-      </w:r>
-    </w:p>
-    <w:p>
-      <w:pPr>
-        <w:pStyle w:val="fhtwFlietext03Arial"/>
-        <w:rPr>
-          <w:lang w:val="en-US" w:eastAsia="en-US" w:bidi="ar-SA"/>
-        </w:rPr>
-      </w:pPr>
-      <w:r>
-        <w:rPr>
-          <w:lang w:val="en-US" w:eastAsia="en-US" w:bidi="ar-SA"/>
-        </w:rPr>
-        <w:t>[ASP.Net] Summary</w:t>
-      </w:r>
-    </w:p>
-    <w:p>
-      <w:pPr>
-        <w:pStyle w:val="fhtwFlietext03Arial"/>
-        <w:rPr>
-          <w:lang w:val="en-US" w:eastAsia="en-US" w:bidi="ar-SA"/>
-        </w:rPr>
-      </w:pPr>
-      <w:r>
-        <w:rPr>
-          <w:lang w:val="en-US" w:eastAsia="en-US" w:bidi="ar-SA"/>
-        </w:rPr>
-      </w:r>
-    </w:p>
-    <w:p>
-      <w:pPr>
-        <w:pStyle w:val="fhtwberschrift06Arialbold"/>
-        <w:rPr>
-          <w:lang w:val="en-US" w:eastAsia="en-US" w:bidi="ar-SA"/>
-        </w:rPr>
-      </w:pPr>
-      <w:r>
-        <w:rPr>
-          <w:sz w:val="32"/>
-          <w:szCs w:val="32"/>
-          <w:lang w:val="en-US" w:eastAsia="en-US" w:bidi="ar-SA"/>
-        </w:rPr>
-        <w:t>A</w:t>
-      </w:r>
-      <w:r>
-        <w:rPr>
-          <w:sz w:val="32"/>
-          <w:szCs w:val="32"/>
-          <w:lang w:val="en-US" w:eastAsia="en-US" w:bidi="ar-SA"/>
-        </w:rPr>
-        <w:t>uthentication:</w:t>
+        <w:t>Authentication:</w:t>
       </w:r>
     </w:p>
     <w:p>
@@ -2742,15 +3466,15 @@
         </w:tblCellMar>
       </w:tblPr>
       <w:tblGrid>
-        <w:gridCol w:w="1299"/>
-        <w:gridCol w:w="6581"/>
+        <w:gridCol w:w="1298"/>
+        <w:gridCol w:w="6582"/>
         <w:gridCol w:w="2040"/>
       </w:tblGrid>
       <w:tr>
         <w:trPr/>
         <w:tc>
           <w:tcPr>
-            <w:tcW w:w="1299" w:type="dxa"/>
+            <w:tcW w:w="1298" w:type="dxa"/>
             <w:tcBorders>
               <w:top w:val="single" w:sz="4" w:space="0" w:color="000000"/>
               <w:start w:val="single" w:sz="4" w:space="0" w:color="000000"/>
@@ -2775,7 +3499,7 @@
         </w:tc>
         <w:tc>
           <w:tcPr>
-            <w:tcW w:w="6581" w:type="dxa"/>
+            <w:tcW w:w="6582" w:type="dxa"/>
             <w:tcBorders>
               <w:top w:val="single" w:sz="4" w:space="0" w:color="000000"/>
               <w:start w:val="single" w:sz="4" w:space="0" w:color="000000"/>
@@ -2829,7 +3553,7 @@
         <w:trPr/>
         <w:tc>
           <w:tcPr>
-            <w:tcW w:w="1299" w:type="dxa"/>
+            <w:tcW w:w="1298" w:type="dxa"/>
             <w:tcBorders>
               <w:start w:val="single" w:sz="4" w:space="0" w:color="000000"/>
               <w:bottom w:val="single" w:sz="4" w:space="0" w:color="000000"/>
@@ -2852,7 +3576,7 @@
         </w:tc>
         <w:tc>
           <w:tcPr>
-            <w:tcW w:w="6581" w:type="dxa"/>
+            <w:tcW w:w="6582" w:type="dxa"/>
             <w:tcBorders>
               <w:start w:val="single" w:sz="4" w:space="0" w:color="000000"/>
               <w:bottom w:val="single" w:sz="4" w:space="0" w:color="000000"/>
@@ -2902,7 +3626,7 @@
         <w:trPr/>
         <w:tc>
           <w:tcPr>
-            <w:tcW w:w="1299" w:type="dxa"/>
+            <w:tcW w:w="1298" w:type="dxa"/>
             <w:tcBorders>
               <w:start w:val="single" w:sz="4" w:space="0" w:color="000000"/>
               <w:bottom w:val="single" w:sz="4" w:space="0" w:color="000000"/>
@@ -2925,7 +3649,7 @@
         </w:tc>
         <w:tc>
           <w:tcPr>
-            <w:tcW w:w="6581" w:type="dxa"/>
+            <w:tcW w:w="6582" w:type="dxa"/>
             <w:tcBorders>
               <w:start w:val="single" w:sz="4" w:space="0" w:color="000000"/>
               <w:bottom w:val="single" w:sz="4" w:space="0" w:color="000000"/>
@@ -2975,7 +3699,7 @@
         <w:trPr/>
         <w:tc>
           <w:tcPr>
-            <w:tcW w:w="1299" w:type="dxa"/>
+            <w:tcW w:w="1298" w:type="dxa"/>
             <w:tcBorders>
               <w:start w:val="single" w:sz="4" w:space="0" w:color="000000"/>
               <w:bottom w:val="single" w:sz="4" w:space="0" w:color="000000"/>
@@ -2998,7 +3722,7 @@
         </w:tc>
         <w:tc>
           <w:tcPr>
-            <w:tcW w:w="6581" w:type="dxa"/>
+            <w:tcW w:w="6582" w:type="dxa"/>
             <w:tcBorders>
               <w:start w:val="single" w:sz="4" w:space="0" w:color="000000"/>
               <w:bottom w:val="single" w:sz="4" w:space="0" w:color="000000"/>
@@ -3048,7 +3772,7 @@
         <w:trPr/>
         <w:tc>
           <w:tcPr>
-            <w:tcW w:w="1299" w:type="dxa"/>
+            <w:tcW w:w="1298" w:type="dxa"/>
             <w:tcBorders>
               <w:start w:val="single" w:sz="4" w:space="0" w:color="000000"/>
               <w:bottom w:val="single" w:sz="4" w:space="0" w:color="000000"/>
@@ -3071,7 +3795,7 @@
         </w:tc>
         <w:tc>
           <w:tcPr>
-            <w:tcW w:w="6581" w:type="dxa"/>
+            <w:tcW w:w="6582" w:type="dxa"/>
             <w:tcBorders>
               <w:start w:val="single" w:sz="4" w:space="0" w:color="000000"/>
               <w:bottom w:val="single" w:sz="4" w:space="0" w:color="000000"/>
@@ -3121,7 +3845,7 @@
         <w:trPr/>
         <w:tc>
           <w:tcPr>
-            <w:tcW w:w="1299" w:type="dxa"/>
+            <w:tcW w:w="1298" w:type="dxa"/>
             <w:tcBorders>
               <w:start w:val="single" w:sz="4" w:space="0" w:color="000000"/>
               <w:bottom w:val="single" w:sz="4" w:space="0" w:color="000000"/>
@@ -3144,7 +3868,7 @@
         </w:tc>
         <w:tc>
           <w:tcPr>
-            <w:tcW w:w="6581" w:type="dxa"/>
+            <w:tcW w:w="6582" w:type="dxa"/>
             <w:tcBorders>
               <w:start w:val="single" w:sz="4" w:space="0" w:color="000000"/>
               <w:bottom w:val="single" w:sz="4" w:space="0" w:color="000000"/>
@@ -3194,7 +3918,7 @@
         <w:trPr/>
         <w:tc>
           <w:tcPr>
-            <w:tcW w:w="1299" w:type="dxa"/>
+            <w:tcW w:w="1298" w:type="dxa"/>
             <w:tcBorders>
               <w:start w:val="single" w:sz="4" w:space="0" w:color="000000"/>
               <w:bottom w:val="single" w:sz="4" w:space="0" w:color="000000"/>
@@ -3217,7 +3941,7 @@
         </w:tc>
         <w:tc>
           <w:tcPr>
-            <w:tcW w:w="6581" w:type="dxa"/>
+            <w:tcW w:w="6582" w:type="dxa"/>
             <w:tcBorders>
               <w:start w:val="single" w:sz="4" w:space="0" w:color="000000"/>
               <w:bottom w:val="single" w:sz="4" w:space="0" w:color="000000"/>
@@ -3267,7 +3991,7 @@
         <w:trPr/>
         <w:tc>
           <w:tcPr>
-            <w:tcW w:w="1299" w:type="dxa"/>
+            <w:tcW w:w="1298" w:type="dxa"/>
             <w:tcBorders>
               <w:start w:val="single" w:sz="4" w:space="0" w:color="000000"/>
               <w:bottom w:val="single" w:sz="4" w:space="0" w:color="000000"/>
@@ -3290,7 +4014,7 @@
         </w:tc>
         <w:tc>
           <w:tcPr>
-            <w:tcW w:w="6581" w:type="dxa"/>
+            <w:tcW w:w="6582" w:type="dxa"/>
             <w:tcBorders>
               <w:start w:val="single" w:sz="4" w:space="0" w:color="000000"/>
               <w:bottom w:val="single" w:sz="4" w:space="0" w:color="000000"/>
@@ -3340,7 +4064,7 @@
         <w:trPr/>
         <w:tc>
           <w:tcPr>
-            <w:tcW w:w="1299" w:type="dxa"/>
+            <w:tcW w:w="1298" w:type="dxa"/>
             <w:tcBorders>
               <w:start w:val="single" w:sz="4" w:space="0" w:color="000000"/>
               <w:bottom w:val="single" w:sz="4" w:space="0" w:color="000000"/>
@@ -3363,7 +4087,7 @@
         </w:tc>
         <w:tc>
           <w:tcPr>
-            <w:tcW w:w="6581" w:type="dxa"/>
+            <w:tcW w:w="6582" w:type="dxa"/>
             <w:tcBorders>
               <w:start w:val="single" w:sz="4" w:space="0" w:color="000000"/>
               <w:bottom w:val="single" w:sz="4" w:space="0" w:color="000000"/>
@@ -3413,7 +4137,7 @@
         <w:trPr/>
         <w:tc>
           <w:tcPr>
-            <w:tcW w:w="1299" w:type="dxa"/>
+            <w:tcW w:w="1298" w:type="dxa"/>
             <w:tcBorders>
               <w:start w:val="single" w:sz="4" w:space="0" w:color="000000"/>
               <w:bottom w:val="single" w:sz="4" w:space="0" w:color="000000"/>
@@ -3436,7 +4160,7 @@
         </w:tc>
         <w:tc>
           <w:tcPr>
-            <w:tcW w:w="6581" w:type="dxa"/>
+            <w:tcW w:w="6582" w:type="dxa"/>
             <w:tcBorders>
               <w:start w:val="single" w:sz="4" w:space="0" w:color="000000"/>
               <w:bottom w:val="single" w:sz="4" w:space="0" w:color="000000"/>
@@ -3486,7 +4210,7 @@
         <w:trPr/>
         <w:tc>
           <w:tcPr>
-            <w:tcW w:w="1299" w:type="dxa"/>
+            <w:tcW w:w="1298" w:type="dxa"/>
             <w:tcBorders>
               <w:start w:val="single" w:sz="4" w:space="0" w:color="000000"/>
               <w:bottom w:val="single" w:sz="4" w:space="0" w:color="000000"/>
@@ -3509,7 +4233,7 @@
         </w:tc>
         <w:tc>
           <w:tcPr>
-            <w:tcW w:w="6581" w:type="dxa"/>
+            <w:tcW w:w="6582" w:type="dxa"/>
             <w:tcBorders>
               <w:start w:val="single" w:sz="4" w:space="0" w:color="000000"/>
               <w:bottom w:val="single" w:sz="4" w:space="0" w:color="000000"/>
@@ -3559,7 +4283,7 @@
         <w:trPr/>
         <w:tc>
           <w:tcPr>
-            <w:tcW w:w="1299" w:type="dxa"/>
+            <w:tcW w:w="1298" w:type="dxa"/>
             <w:tcBorders>
               <w:start w:val="single" w:sz="4" w:space="0" w:color="000000"/>
               <w:bottom w:val="single" w:sz="4" w:space="0" w:color="000000"/>
@@ -3582,7 +4306,7 @@
         </w:tc>
         <w:tc>
           <w:tcPr>
-            <w:tcW w:w="6581" w:type="dxa"/>
+            <w:tcW w:w="6582" w:type="dxa"/>
             <w:tcBorders>
               <w:start w:val="single" w:sz="4" w:space="0" w:color="000000"/>
               <w:bottom w:val="single" w:sz="4" w:space="0" w:color="000000"/>
@@ -3632,7 +4356,7 @@
         <w:trPr/>
         <w:tc>
           <w:tcPr>
-            <w:tcW w:w="1299" w:type="dxa"/>
+            <w:tcW w:w="1298" w:type="dxa"/>
             <w:tcBorders>
               <w:start w:val="single" w:sz="4" w:space="0" w:color="000000"/>
               <w:bottom w:val="single" w:sz="4" w:space="0" w:color="000000"/>
@@ -3655,7 +4379,7 @@
         </w:tc>
         <w:tc>
           <w:tcPr>
-            <w:tcW w:w="6581" w:type="dxa"/>
+            <w:tcW w:w="6582" w:type="dxa"/>
             <w:tcBorders>
               <w:start w:val="single" w:sz="4" w:space="0" w:color="000000"/>
               <w:bottom w:val="single" w:sz="4" w:space="0" w:color="000000"/>
@@ -3705,7 +4429,7 @@
         <w:trPr/>
         <w:tc>
           <w:tcPr>
-            <w:tcW w:w="1299" w:type="dxa"/>
+            <w:tcW w:w="1298" w:type="dxa"/>
             <w:tcBorders>
               <w:start w:val="single" w:sz="4" w:space="0" w:color="000000"/>
               <w:bottom w:val="single" w:sz="4" w:space="0" w:color="000000"/>
@@ -3728,7 +4452,7 @@
         </w:tc>
         <w:tc>
           <w:tcPr>
-            <w:tcW w:w="6581" w:type="dxa"/>
+            <w:tcW w:w="6582" w:type="dxa"/>
             <w:tcBorders>
               <w:start w:val="single" w:sz="4" w:space="0" w:color="000000"/>
               <w:bottom w:val="single" w:sz="4" w:space="0" w:color="000000"/>
@@ -3778,7 +4502,7 @@
         <w:trPr/>
         <w:tc>
           <w:tcPr>
-            <w:tcW w:w="1299" w:type="dxa"/>
+            <w:tcW w:w="1298" w:type="dxa"/>
             <w:tcBorders>
               <w:start w:val="single" w:sz="4" w:space="0" w:color="000000"/>
               <w:bottom w:val="single" w:sz="4" w:space="0" w:color="000000"/>
@@ -3801,7 +4525,7 @@
         </w:tc>
         <w:tc>
           <w:tcPr>
-            <w:tcW w:w="6581" w:type="dxa"/>
+            <w:tcW w:w="6582" w:type="dxa"/>
             <w:tcBorders>
               <w:start w:val="single" w:sz="4" w:space="0" w:color="000000"/>
               <w:bottom w:val="single" w:sz="4" w:space="0" w:color="000000"/>
@@ -3862,12 +4586,12 @@
       </w:r>
     </w:p>
     <w:sectPr>
-      <w:headerReference w:type="even" r:id="rId17"/>
-      <w:headerReference w:type="default" r:id="rId18"/>
-      <w:headerReference w:type="first" r:id="rId19"/>
-      <w:footerReference w:type="even" r:id="rId20"/>
-      <w:footerReference w:type="default" r:id="rId21"/>
-      <w:footerReference w:type="first" r:id="rId22"/>
+      <w:headerReference w:type="even" r:id="rId19"/>
+      <w:headerReference w:type="default" r:id="rId20"/>
+      <w:headerReference w:type="first" r:id="rId21"/>
+      <w:footerReference w:type="even" r:id="rId22"/>
+      <w:footerReference w:type="default" r:id="rId23"/>
+      <w:footerReference w:type="first" r:id="rId24"/>
       <w:type w:val="nextPage"/>
       <w:pgSz w:w="11906" w:h="16838"/>
       <w:pgMar w:left="1680" w:right="280" w:gutter="0" w:header="720" w:top="777" w:footer="720" w:bottom="1680"/>
@@ -3947,7 +4671,7 @@
                       <w:txbxContent>
                         <w:p>
                           <w:pPr>
-                            <w:pStyle w:val="FrameContentsuser"/>
+                            <w:pStyle w:val="FrameContents"/>
                             <w:jc w:val="end"/>
                             <w:rPr>
                               <w:rFonts w:ascii="Arial" w:hAnsi="Arial" w:eastAsia="" w:cs="Arial" w:eastAsiaTheme="majorEastAsia"/>
@@ -4045,7 +4769,7 @@
                 <w:txbxContent>
                   <w:p>
                     <w:pPr>
-                      <w:pStyle w:val="FrameContentsuser"/>
+                      <w:pStyle w:val="FrameContents"/>
                       <w:jc w:val="end"/>
                       <w:rPr>
                         <w:rFonts w:ascii="Arial" w:hAnsi="Arial" w:eastAsia="" w:cs="Arial" w:eastAsiaTheme="majorEastAsia"/>
@@ -4218,7 +4942,7 @@
     <w:r>
       <w:rPr/>
       <w:drawing>
-        <wp:anchor distT="0" distB="0" distL="0" distR="0" simplePos="0" relativeHeight="9" behindDoc="1" locked="0" layoutInCell="1" allowOverlap="1">
+        <wp:anchor distT="0" distB="0" distL="0" distR="0" simplePos="0" relativeHeight="11" behindDoc="1" locked="0" layoutInCell="1" allowOverlap="1">
           <wp:simplePos x="0" y="0"/>
           <wp:positionH relativeFrom="column">
             <wp:posOffset>-1066800</wp:posOffset>
@@ -4229,7 +4953,7 @@
           <wp:extent cx="7554595" cy="432435"/>
           <wp:effectExtent l="0" t="0" r="0" b="0"/>
           <wp:wrapNone/>
-          <wp:docPr id="16" name="Grafik 38 Copy 1"/>
+          <wp:docPr id="19" name="Grafik 38 Copy 1"/>
           <wp:cNvGraphicFramePr>
             <a:graphicFrameLocks xmlns:a="http://schemas.openxmlformats.org/drawingml/2006/main" noChangeAspect="1"/>
           </wp:cNvGraphicFramePr>
@@ -4237,7 +4961,7 @@
             <a:graphicData uri="http://schemas.openxmlformats.org/drawingml/2006/picture">
               <pic:pic xmlns:pic="http://schemas.openxmlformats.org/drawingml/2006/picture">
                 <pic:nvPicPr>
-                  <pic:cNvPr id="16" name="Grafik 38 Copy 1"/>
+                  <pic:cNvPr id="19" name="Grafik 38 Copy 1"/>
                   <pic:cNvPicPr>
                     <a:picLocks noChangeAspect="1" noChangeArrowheads="1"/>
                   </pic:cNvPicPr>
@@ -4266,7 +4990,7 @@
       <mc:AlternateContent>
         <mc:Choice Requires="wps">
           <w:drawing>
-            <wp:anchor distT="0" distB="0" distL="0" distR="0" simplePos="0" relativeHeight="20" behindDoc="1" locked="0" layoutInCell="0" allowOverlap="1" wp14:anchorId="33EA5CF7">
+            <wp:anchor distT="0" distB="0" distL="0" distR="0" simplePos="0" relativeHeight="26" behindDoc="1" locked="0" layoutInCell="0" allowOverlap="1" wp14:anchorId="33EA5CF7">
               <wp:simplePos x="0" y="0"/>
               <wp:positionH relativeFrom="rightMargin">
                 <wp:posOffset>-1252220</wp:posOffset>
@@ -4277,7 +5001,7 @@
               <wp:extent cx="1155065" cy="212090"/>
               <wp:effectExtent l="0" t="0" r="0" b="0"/>
               <wp:wrapNone/>
-              <wp:docPr id="17" name="Rectangle 2"/>
+              <wp:docPr id="20" name="Rectangle 2"/>
               <a:graphic xmlns:a="http://schemas.openxmlformats.org/drawingml/2006/main">
                 <a:graphicData uri="http://schemas.microsoft.com/office/word/2010/wordprocessingShape">
                   <wps:wsp>
@@ -4307,7 +5031,7 @@
                       <w:txbxContent>
                         <w:p>
                           <w:pPr>
-                            <w:pStyle w:val="FrameContentsuser"/>
+                            <w:pStyle w:val="FrameContents"/>
                             <w:jc w:val="end"/>
                             <w:rPr>
                               <w:rFonts w:ascii="Arial" w:hAnsi="Arial" w:eastAsia="" w:cs="Arial" w:eastAsiaTheme="majorEastAsia"/>
@@ -4363,7 +5087,7 @@
                                   <w:sz w:val="20"/>
                                   <w:szCs w:val="20"/>
                                 </w:rPr>
-                                <w:t>7</w:t>
+                                <w:t>9</w:t>
                               </w:r>
                               <w:r>
                                 <w:rPr>
@@ -4405,7 +5129,7 @@
                 <w:txbxContent>
                   <w:p>
                     <w:pPr>
-                      <w:pStyle w:val="FrameContentsuser"/>
+                      <w:pStyle w:val="FrameContents"/>
                       <w:jc w:val="end"/>
                       <w:rPr>
                         <w:rFonts w:ascii="Arial" w:hAnsi="Arial" w:eastAsia="" w:cs="Arial" w:eastAsiaTheme="majorEastAsia"/>
@@ -4461,7 +5185,7 @@
                             <w:sz w:val="20"/>
                             <w:szCs w:val="20"/>
                           </w:rPr>
-                          <w:t>7</w:t>
+                          <w:t>9</w:t>
                         </w:r>
                         <w:r>
                           <w:rPr>
@@ -4505,7 +5229,7 @@
     <w:r>
       <w:rPr/>
       <w:drawing>
-        <wp:anchor distT="0" distB="0" distL="0" distR="0" simplePos="0" relativeHeight="9" behindDoc="1" locked="0" layoutInCell="1" allowOverlap="1">
+        <wp:anchor distT="0" distB="0" distL="0" distR="0" simplePos="0" relativeHeight="11" behindDoc="1" locked="0" layoutInCell="1" allowOverlap="1">
           <wp:simplePos x="0" y="0"/>
           <wp:positionH relativeFrom="column">
             <wp:posOffset>-1066800</wp:posOffset>
@@ -4516,7 +5240,7 @@
           <wp:extent cx="7554595" cy="432435"/>
           <wp:effectExtent l="0" t="0" r="0" b="0"/>
           <wp:wrapNone/>
-          <wp:docPr id="18" name="Grafik 38 Copy 1"/>
+          <wp:docPr id="21" name="Grafik 38 Copy 1"/>
           <wp:cNvGraphicFramePr>
             <a:graphicFrameLocks xmlns:a="http://schemas.openxmlformats.org/drawingml/2006/main" noChangeAspect="1"/>
           </wp:cNvGraphicFramePr>
@@ -4524,7 +5248,7 @@
             <a:graphicData uri="http://schemas.openxmlformats.org/drawingml/2006/picture">
               <pic:pic xmlns:pic="http://schemas.openxmlformats.org/drawingml/2006/picture">
                 <pic:nvPicPr>
-                  <pic:cNvPr id="18" name="Grafik 38 Copy 1"/>
+                  <pic:cNvPr id="21" name="Grafik 38 Copy 1"/>
                   <pic:cNvPicPr>
                     <a:picLocks noChangeAspect="1" noChangeArrowheads="1"/>
                   </pic:cNvPicPr>
@@ -4553,7 +5277,7 @@
       <mc:AlternateContent>
         <mc:Choice Requires="wps">
           <w:drawing>
-            <wp:anchor distT="0" distB="0" distL="0" distR="0" simplePos="0" relativeHeight="20" behindDoc="1" locked="0" layoutInCell="0" allowOverlap="1" wp14:anchorId="33EA5CF7">
+            <wp:anchor distT="0" distB="0" distL="0" distR="0" simplePos="0" relativeHeight="26" behindDoc="1" locked="0" layoutInCell="0" allowOverlap="1" wp14:anchorId="33EA5CF7">
               <wp:simplePos x="0" y="0"/>
               <wp:positionH relativeFrom="rightMargin">
                 <wp:posOffset>-1252220</wp:posOffset>
@@ -4564,7 +5288,7 @@
               <wp:extent cx="1155065" cy="212090"/>
               <wp:effectExtent l="0" t="0" r="0" b="0"/>
               <wp:wrapNone/>
-              <wp:docPr id="19" name="Rectangle 2"/>
+              <wp:docPr id="22" name="Rectangle 2"/>
               <a:graphic xmlns:a="http://schemas.openxmlformats.org/drawingml/2006/main">
                 <a:graphicData uri="http://schemas.microsoft.com/office/word/2010/wordprocessingShape">
                   <wps:wsp>
@@ -4594,7 +5318,7 @@
                       <w:txbxContent>
                         <w:p>
                           <w:pPr>
-                            <w:pStyle w:val="FrameContentsuser"/>
+                            <w:pStyle w:val="FrameContents"/>
                             <w:jc w:val="end"/>
                             <w:rPr>
                               <w:rFonts w:ascii="Arial" w:hAnsi="Arial" w:eastAsia="" w:cs="Arial" w:eastAsiaTheme="majorEastAsia"/>
@@ -4650,7 +5374,7 @@
                                   <w:sz w:val="20"/>
                                   <w:szCs w:val="20"/>
                                 </w:rPr>
-                                <w:t>7</w:t>
+                                <w:t>9</w:t>
                               </w:r>
                               <w:r>
                                 <w:rPr>
@@ -4692,7 +5416,7 @@
                 <w:txbxContent>
                   <w:p>
                     <w:pPr>
-                      <w:pStyle w:val="FrameContentsuser"/>
+                      <w:pStyle w:val="FrameContents"/>
                       <w:jc w:val="end"/>
                       <w:rPr>
                         <w:rFonts w:ascii="Arial" w:hAnsi="Arial" w:eastAsia="" w:cs="Arial" w:eastAsiaTheme="majorEastAsia"/>
@@ -4748,7 +5472,7 @@
                             <w:sz w:val="20"/>
                             <w:szCs w:val="20"/>
                           </w:rPr>
-                          <w:t>7</w:t>
+                          <w:t>9</w:t>
                         </w:r>
                         <w:r>
                           <w:rPr>
@@ -4910,6 +5634,413 @@
     </w:r>
   </w:p>
 </w:hdr>
+</file>
+
+<file path=word/numbering.xml><?xml version="1.0" encoding="utf-8"?>
+<w:numbering xmlns:w="http://schemas.openxmlformats.org/wordprocessingml/2006/main" xmlns:o="urn:schemas-microsoft-com:office:office" xmlns:r="http://schemas.openxmlformats.org/officeDocument/2006/relationships" xmlns:v="urn:schemas-microsoft-com:vml" xmlns:mc="http://schemas.openxmlformats.org/markup-compatibility/2006" xmlns:w14="http://schemas.microsoft.com/office/word/2010/wordml" mc:Ignorable="w14">
+  <w:abstractNum w:abstractNumId="1">
+    <w:lvl w:ilvl="0">
+      <w:start w:val="1"/>
+      <w:numFmt w:val="bullet"/>
+      <w:lvlText w:val=""/>
+      <w:lvlJc w:val="start"/>
+      <w:pPr>
+        <w:tabs>
+          <w:tab w:val="num" w:pos="153"/>
+        </w:tabs>
+        <w:ind w:start="153" w:hanging="360"/>
+      </w:pPr>
+      <w:rPr>
+        <w:rFonts w:ascii="Symbol" w:hAnsi="Symbol" w:cs="Symbol" w:hint="default"/>
+      </w:rPr>
+    </w:lvl>
+    <w:lvl w:ilvl="1">
+      <w:start w:val="1"/>
+      <w:numFmt w:val="bullet"/>
+      <w:lvlText w:val="◦"/>
+      <w:lvlJc w:val="start"/>
+      <w:pPr>
+        <w:tabs>
+          <w:tab w:val="num" w:pos="513"/>
+        </w:tabs>
+        <w:ind w:start="513" w:hanging="360"/>
+      </w:pPr>
+      <w:rPr>
+        <w:rFonts w:ascii="OpenSymbol" w:hAnsi="OpenSymbol" w:cs="OpenSymbol" w:hint="default"/>
+      </w:rPr>
+    </w:lvl>
+    <w:lvl w:ilvl="2">
+      <w:start w:val="1"/>
+      <w:numFmt w:val="bullet"/>
+      <w:lvlText w:val="▪"/>
+      <w:lvlJc w:val="start"/>
+      <w:pPr>
+        <w:tabs>
+          <w:tab w:val="num" w:pos="873"/>
+        </w:tabs>
+        <w:ind w:start="873" w:hanging="360"/>
+      </w:pPr>
+      <w:rPr>
+        <w:rFonts w:ascii="OpenSymbol" w:hAnsi="OpenSymbol" w:cs="OpenSymbol" w:hint="default"/>
+      </w:rPr>
+    </w:lvl>
+    <w:lvl w:ilvl="3">
+      <w:start w:val="1"/>
+      <w:numFmt w:val="bullet"/>
+      <w:lvlText w:val=""/>
+      <w:lvlJc w:val="start"/>
+      <w:pPr>
+        <w:tabs>
+          <w:tab w:val="num" w:pos="1233"/>
+        </w:tabs>
+        <w:ind w:start="1233" w:hanging="360"/>
+      </w:pPr>
+      <w:rPr>
+        <w:rFonts w:ascii="Symbol" w:hAnsi="Symbol" w:cs="Symbol" w:hint="default"/>
+      </w:rPr>
+    </w:lvl>
+    <w:lvl w:ilvl="4">
+      <w:start w:val="1"/>
+      <w:numFmt w:val="bullet"/>
+      <w:lvlText w:val="◦"/>
+      <w:lvlJc w:val="start"/>
+      <w:pPr>
+        <w:tabs>
+          <w:tab w:val="num" w:pos="1593"/>
+        </w:tabs>
+        <w:ind w:start="1593" w:hanging="360"/>
+      </w:pPr>
+      <w:rPr>
+        <w:rFonts w:ascii="OpenSymbol" w:hAnsi="OpenSymbol" w:cs="OpenSymbol" w:hint="default"/>
+      </w:rPr>
+    </w:lvl>
+    <w:lvl w:ilvl="5">
+      <w:start w:val="1"/>
+      <w:numFmt w:val="bullet"/>
+      <w:lvlText w:val="▪"/>
+      <w:lvlJc w:val="start"/>
+      <w:pPr>
+        <w:tabs>
+          <w:tab w:val="num" w:pos="1953"/>
+        </w:tabs>
+        <w:ind w:start="1953" w:hanging="360"/>
+      </w:pPr>
+      <w:rPr>
+        <w:rFonts w:ascii="OpenSymbol" w:hAnsi="OpenSymbol" w:cs="OpenSymbol" w:hint="default"/>
+      </w:rPr>
+    </w:lvl>
+    <w:lvl w:ilvl="6">
+      <w:start w:val="1"/>
+      <w:numFmt w:val="bullet"/>
+      <w:lvlText w:val=""/>
+      <w:lvlJc w:val="start"/>
+      <w:pPr>
+        <w:tabs>
+          <w:tab w:val="num" w:pos="2313"/>
+        </w:tabs>
+        <w:ind w:start="2313" w:hanging="360"/>
+      </w:pPr>
+      <w:rPr>
+        <w:rFonts w:ascii="Symbol" w:hAnsi="Symbol" w:cs="Symbol" w:hint="default"/>
+      </w:rPr>
+    </w:lvl>
+    <w:lvl w:ilvl="7">
+      <w:start w:val="1"/>
+      <w:numFmt w:val="bullet"/>
+      <w:lvlText w:val="◦"/>
+      <w:lvlJc w:val="start"/>
+      <w:pPr>
+        <w:tabs>
+          <w:tab w:val="num" w:pos="2673"/>
+        </w:tabs>
+        <w:ind w:start="2673" w:hanging="360"/>
+      </w:pPr>
+      <w:rPr>
+        <w:rFonts w:ascii="OpenSymbol" w:hAnsi="OpenSymbol" w:cs="OpenSymbol" w:hint="default"/>
+      </w:rPr>
+    </w:lvl>
+    <w:lvl w:ilvl="8">
+      <w:start w:val="1"/>
+      <w:numFmt w:val="bullet"/>
+      <w:lvlText w:val="▪"/>
+      <w:lvlJc w:val="start"/>
+      <w:pPr>
+        <w:tabs>
+          <w:tab w:val="num" w:pos="3033"/>
+        </w:tabs>
+        <w:ind w:start="3033" w:hanging="360"/>
+      </w:pPr>
+      <w:rPr>
+        <w:rFonts w:ascii="OpenSymbol" w:hAnsi="OpenSymbol" w:cs="OpenSymbol" w:hint="default"/>
+      </w:rPr>
+    </w:lvl>
+  </w:abstractNum>
+  <w:abstractNum w:abstractNumId="2">
+    <w:lvl w:ilvl="0">
+      <w:start w:val="1"/>
+      <w:numFmt w:val="bullet"/>
+      <w:lvlText w:val=""/>
+      <w:lvlJc w:val="start"/>
+      <w:pPr>
+        <w:tabs>
+          <w:tab w:val="num" w:pos="153"/>
+        </w:tabs>
+        <w:ind w:start="153" w:hanging="360"/>
+      </w:pPr>
+      <w:rPr>
+        <w:rFonts w:ascii="Symbol" w:hAnsi="Symbol" w:cs="Symbol" w:hint="default"/>
+      </w:rPr>
+    </w:lvl>
+    <w:lvl w:ilvl="1">
+      <w:start w:val="1"/>
+      <w:numFmt w:val="bullet"/>
+      <w:lvlText w:val="◦"/>
+      <w:lvlJc w:val="start"/>
+      <w:pPr>
+        <w:tabs>
+          <w:tab w:val="num" w:pos="513"/>
+        </w:tabs>
+        <w:ind w:start="513" w:hanging="360"/>
+      </w:pPr>
+      <w:rPr>
+        <w:rFonts w:ascii="OpenSymbol" w:hAnsi="OpenSymbol" w:cs="OpenSymbol" w:hint="default"/>
+      </w:rPr>
+    </w:lvl>
+    <w:lvl w:ilvl="2">
+      <w:start w:val="1"/>
+      <w:numFmt w:val="bullet"/>
+      <w:lvlText w:val="▪"/>
+      <w:lvlJc w:val="start"/>
+      <w:pPr>
+        <w:tabs>
+          <w:tab w:val="num" w:pos="873"/>
+        </w:tabs>
+        <w:ind w:start="873" w:hanging="360"/>
+      </w:pPr>
+      <w:rPr>
+        <w:rFonts w:ascii="OpenSymbol" w:hAnsi="OpenSymbol" w:cs="OpenSymbol" w:hint="default"/>
+      </w:rPr>
+    </w:lvl>
+    <w:lvl w:ilvl="3">
+      <w:start w:val="1"/>
+      <w:numFmt w:val="bullet"/>
+      <w:lvlText w:val=""/>
+      <w:lvlJc w:val="start"/>
+      <w:pPr>
+        <w:tabs>
+          <w:tab w:val="num" w:pos="1233"/>
+        </w:tabs>
+        <w:ind w:start="1233" w:hanging="360"/>
+      </w:pPr>
+      <w:rPr>
+        <w:rFonts w:ascii="Symbol" w:hAnsi="Symbol" w:cs="Symbol" w:hint="default"/>
+      </w:rPr>
+    </w:lvl>
+    <w:lvl w:ilvl="4">
+      <w:start w:val="1"/>
+      <w:numFmt w:val="bullet"/>
+      <w:lvlText w:val="◦"/>
+      <w:lvlJc w:val="start"/>
+      <w:pPr>
+        <w:tabs>
+          <w:tab w:val="num" w:pos="1593"/>
+        </w:tabs>
+        <w:ind w:start="1593" w:hanging="360"/>
+      </w:pPr>
+      <w:rPr>
+        <w:rFonts w:ascii="OpenSymbol" w:hAnsi="OpenSymbol" w:cs="OpenSymbol" w:hint="default"/>
+      </w:rPr>
+    </w:lvl>
+    <w:lvl w:ilvl="5">
+      <w:start w:val="1"/>
+      <w:numFmt w:val="bullet"/>
+      <w:lvlText w:val="▪"/>
+      <w:lvlJc w:val="start"/>
+      <w:pPr>
+        <w:tabs>
+          <w:tab w:val="num" w:pos="1953"/>
+        </w:tabs>
+        <w:ind w:start="1953" w:hanging="360"/>
+      </w:pPr>
+      <w:rPr>
+        <w:rFonts w:ascii="OpenSymbol" w:hAnsi="OpenSymbol" w:cs="OpenSymbol" w:hint="default"/>
+      </w:rPr>
+    </w:lvl>
+    <w:lvl w:ilvl="6">
+      <w:start w:val="1"/>
+      <w:numFmt w:val="bullet"/>
+      <w:lvlText w:val=""/>
+      <w:lvlJc w:val="start"/>
+      <w:pPr>
+        <w:tabs>
+          <w:tab w:val="num" w:pos="2313"/>
+        </w:tabs>
+        <w:ind w:start="2313" w:hanging="360"/>
+      </w:pPr>
+      <w:rPr>
+        <w:rFonts w:ascii="Symbol" w:hAnsi="Symbol" w:cs="Symbol" w:hint="default"/>
+      </w:rPr>
+    </w:lvl>
+    <w:lvl w:ilvl="7">
+      <w:start w:val="1"/>
+      <w:numFmt w:val="bullet"/>
+      <w:lvlText w:val="◦"/>
+      <w:lvlJc w:val="start"/>
+      <w:pPr>
+        <w:tabs>
+          <w:tab w:val="num" w:pos="2673"/>
+        </w:tabs>
+        <w:ind w:start="2673" w:hanging="360"/>
+      </w:pPr>
+      <w:rPr>
+        <w:rFonts w:ascii="OpenSymbol" w:hAnsi="OpenSymbol" w:cs="OpenSymbol" w:hint="default"/>
+      </w:rPr>
+    </w:lvl>
+    <w:lvl w:ilvl="8">
+      <w:start w:val="1"/>
+      <w:numFmt w:val="bullet"/>
+      <w:lvlText w:val="▪"/>
+      <w:lvlJc w:val="start"/>
+      <w:pPr>
+        <w:tabs>
+          <w:tab w:val="num" w:pos="3033"/>
+        </w:tabs>
+        <w:ind w:start="3033" w:hanging="360"/>
+      </w:pPr>
+      <w:rPr>
+        <w:rFonts w:ascii="OpenSymbol" w:hAnsi="OpenSymbol" w:cs="OpenSymbol" w:hint="default"/>
+      </w:rPr>
+    </w:lvl>
+  </w:abstractNum>
+  <w:abstractNum w:abstractNumId="3">
+    <w:lvl w:ilvl="0">
+      <w:start w:val="1"/>
+      <w:numFmt w:val="none"/>
+      <w:suff w:val="nothing"/>
+      <w:lvlText w:val=""/>
+      <w:lvlJc w:val="start"/>
+      <w:pPr>
+        <w:tabs>
+          <w:tab w:val="num" w:pos="0"/>
+        </w:tabs>
+        <w:ind w:start="0" w:hanging="0"/>
+      </w:pPr>
+    </w:lvl>
+    <w:lvl w:ilvl="1">
+      <w:start w:val="1"/>
+      <w:numFmt w:val="none"/>
+      <w:suff w:val="nothing"/>
+      <w:lvlText w:val=""/>
+      <w:lvlJc w:val="start"/>
+      <w:pPr>
+        <w:tabs>
+          <w:tab w:val="num" w:pos="0"/>
+        </w:tabs>
+        <w:ind w:start="0" w:hanging="0"/>
+      </w:pPr>
+    </w:lvl>
+    <w:lvl w:ilvl="2">
+      <w:start w:val="1"/>
+      <w:numFmt w:val="none"/>
+      <w:suff w:val="nothing"/>
+      <w:lvlText w:val=""/>
+      <w:lvlJc w:val="start"/>
+      <w:pPr>
+        <w:tabs>
+          <w:tab w:val="num" w:pos="0"/>
+        </w:tabs>
+        <w:ind w:start="0" w:hanging="0"/>
+      </w:pPr>
+    </w:lvl>
+    <w:lvl w:ilvl="3">
+      <w:start w:val="1"/>
+      <w:numFmt w:val="none"/>
+      <w:suff w:val="nothing"/>
+      <w:lvlText w:val=""/>
+      <w:lvlJc w:val="start"/>
+      <w:pPr>
+        <w:tabs>
+          <w:tab w:val="num" w:pos="0"/>
+        </w:tabs>
+        <w:ind w:start="0" w:hanging="0"/>
+      </w:pPr>
+    </w:lvl>
+    <w:lvl w:ilvl="4">
+      <w:start w:val="1"/>
+      <w:numFmt w:val="none"/>
+      <w:suff w:val="nothing"/>
+      <w:lvlText w:val=""/>
+      <w:lvlJc w:val="start"/>
+      <w:pPr>
+        <w:tabs>
+          <w:tab w:val="num" w:pos="0"/>
+        </w:tabs>
+        <w:ind w:start="0" w:hanging="0"/>
+      </w:pPr>
+    </w:lvl>
+    <w:lvl w:ilvl="5">
+      <w:start w:val="1"/>
+      <w:numFmt w:val="none"/>
+      <w:suff w:val="nothing"/>
+      <w:lvlText w:val=""/>
+      <w:lvlJc w:val="start"/>
+      <w:pPr>
+        <w:tabs>
+          <w:tab w:val="num" w:pos="0"/>
+        </w:tabs>
+        <w:ind w:start="0" w:hanging="0"/>
+      </w:pPr>
+    </w:lvl>
+    <w:lvl w:ilvl="6">
+      <w:start w:val="1"/>
+      <w:numFmt w:val="none"/>
+      <w:suff w:val="nothing"/>
+      <w:lvlText w:val=""/>
+      <w:lvlJc w:val="start"/>
+      <w:pPr>
+        <w:tabs>
+          <w:tab w:val="num" w:pos="0"/>
+        </w:tabs>
+        <w:ind w:start="0" w:hanging="0"/>
+      </w:pPr>
+    </w:lvl>
+    <w:lvl w:ilvl="7">
+      <w:start w:val="1"/>
+      <w:numFmt w:val="none"/>
+      <w:suff w:val="nothing"/>
+      <w:lvlText w:val=""/>
+      <w:lvlJc w:val="start"/>
+      <w:pPr>
+        <w:tabs>
+          <w:tab w:val="num" w:pos="0"/>
+        </w:tabs>
+        <w:ind w:start="0" w:hanging="0"/>
+      </w:pPr>
+    </w:lvl>
+    <w:lvl w:ilvl="8">
+      <w:start w:val="1"/>
+      <w:numFmt w:val="none"/>
+      <w:suff w:val="nothing"/>
+      <w:lvlText w:val=""/>
+      <w:lvlJc w:val="start"/>
+      <w:pPr>
+        <w:tabs>
+          <w:tab w:val="num" w:pos="0"/>
+        </w:tabs>
+        <w:ind w:start="0" w:hanging="0"/>
+      </w:pPr>
+    </w:lvl>
+  </w:abstractNum>
+  <w:num w:numId="1">
+    <w:abstractNumId w:val="1"/>
+  </w:num>
+  <w:num w:numId="2">
+    <w:abstractNumId w:val="2"/>
+  </w:num>
+  <w:num w:numId="3">
+    <w:abstractNumId w:val="3"/>
+  </w:num>
+</w:numbering>
 </file>
 
 <file path=word/styles.xml><?xml version="1.0" encoding="utf-8"?>
@@ -5721,6 +6852,13 @@
       <w:lang w:val="de-DE"/>
     </w:rPr>
   </w:style>
+  <w:style w:type="character" w:styleId="Bullets">
+    <w:name w:val="Bullets"/>
+    <w:qFormat/>
+    <w:rPr>
+      <w:rFonts w:ascii="OpenSymbol" w:hAnsi="OpenSymbol" w:eastAsia="OpenSymbol" w:cs="OpenSymbol"/>
+    </w:rPr>
+  </w:style>
   <w:style w:type="paragraph" w:styleId="Heading">
     <w:name w:val="Heading"/>
     <w:basedOn w:val="Normal"/>
@@ -6065,8 +7203,8 @@
       <w:lang w:val="en-US" w:eastAsia="zh-CN" w:bidi="hi-IN"/>
     </w:rPr>
   </w:style>
-  <w:style w:type="paragraph" w:styleId="FrameContentsuser">
-    <w:name w:val="Frame Contents (user)"/>
+  <w:style w:type="paragraph" w:styleId="FrameContents">
+    <w:name w:val="Frame Contents"/>
     <w:basedOn w:val="Normal"/>
     <w:qFormat/>
     <w:pPr/>
@@ -6082,8 +7220,8 @@
     </w:pPr>
     <w:rPr/>
   </w:style>
-  <w:style w:type="paragraph" w:styleId="FrameContents">
-    <w:name w:val="Frame Contents"/>
+  <w:style w:type="paragraph" w:styleId="FrameContentsuser">
+    <w:name w:val="Frame Contents (user)"/>
     <w:basedOn w:val="Normal"/>
     <w:qFormat/>
     <w:pPr/>

</xml_diff>

<commit_message>
added backend information about the tour
</commit_message>
<xml_diff>
--- a/docs/Team02_Protocol_TourPlanner.docx
+++ b/docs/Team02_Protocol_TourPlanner.docx
@@ -267,24 +267,6 @@
           <w:lang w:val="en-US" w:eastAsia="en-US" w:bidi="ar-SA"/>
         </w:rPr>
         <w:t>DI. Berger Wolfgang</w:t>
-      </w:r>
-    </w:p>
-    <w:p>
-      <w:pPr>
-        <w:pStyle w:val="BodyText"/>
-        <w:ind w:hanging="567"/>
-        <w:rPr>
-          <w:rFonts w:ascii="Times New Roman" w:hAnsi="Times New Roman"/>
-          <w:sz w:val="20"/>
-          <w:lang w:val="en-US" w:eastAsia="en-US" w:bidi="ar-SA"/>
-        </w:rPr>
-      </w:pPr>
-      <w:r>
-        <w:rPr>
-          <w:rFonts w:ascii="Times New Roman" w:hAnsi="Times New Roman"/>
-          <w:sz w:val="20"/>
-          <w:lang w:val="en-US" w:eastAsia="en-US" w:bidi="ar-SA"/>
-        </w:rPr>
       </w:r>
     </w:p>
     <w:p>
@@ -1099,7 +1081,7 @@
         <mc:AlternateContent>
           <mc:Choice Requires="wps">
             <w:drawing>
-              <wp:anchor distT="0" distB="0" distL="114300" distR="113665" simplePos="0" relativeHeight="33" behindDoc="0" locked="0" layoutInCell="0" allowOverlap="1">
+              <wp:anchor distT="0" distB="0" distL="114300" distR="113030" simplePos="0" relativeHeight="36" behindDoc="0" locked="0" layoutInCell="0" allowOverlap="1">
                 <wp:simplePos x="0" y="0"/>
                 <wp:positionH relativeFrom="column">
                   <wp:posOffset>-323850</wp:posOffset>
@@ -1494,54 +1476,36 @@
       <w:r>
         <w:br w:type="page"/>
       </w:r>
-    </w:p>
-    <w:p>
-      <w:pPr>
-        <w:pStyle w:val="Normal"/>
-        <w:rPr/>
-      </w:pPr>
-      <w:r>
-        <w:rPr/>
+      <w:r>
         <mc:AlternateContent>
           <mc:Choice Requires="wps">
             <w:drawing>
-              <wp:anchor distT="0" distB="0" distL="114300" distR="114300" simplePos="0" relativeHeight="35" behindDoc="0" locked="0" layoutInCell="0" allowOverlap="1">
+              <wp:anchor distT="0" distB="0" distL="0" distR="0" simplePos="0" relativeHeight="44" behindDoc="0" locked="0" layoutInCell="0" allowOverlap="1">
                 <wp:simplePos x="0" y="0"/>
                 <wp:positionH relativeFrom="column">
-                  <wp:posOffset>-419100</wp:posOffset>
+                  <wp:align>center</wp:align>
                 </wp:positionH>
                 <wp:positionV relativeFrom="paragraph">
-                  <wp:posOffset>666115</wp:posOffset>
+                  <wp:posOffset>379730</wp:posOffset>
                 </wp:positionV>
-                <wp:extent cx="3524250" cy="3111500"/>
+                <wp:extent cx="3524250" cy="3546475"/>
                 <wp:effectExtent l="0" t="0" r="0" b="0"/>
                 <wp:wrapTopAndBottom/>
-                <wp:docPr id="13" name="Frame3"/>
+                <wp:docPr id="13" name="Frame5"/>
                 <a:graphic xmlns:a="http://schemas.openxmlformats.org/drawingml/2006/main">
                   <a:graphicData uri="http://schemas.microsoft.com/office/word/2010/wordprocessingShape">
                     <wps:wsp>
-                      <wps:cNvSpPr/>
+                      <wps:cNvSpPr txBox="1"/>
                       <wps:spPr>
                         <a:xfrm>
                           <a:off x="0" y="0"/>
-                          <a:ext cx="3524400" cy="3111480"/>
+                          <a:ext cx="3524250" cy="3546475"/>
                         </a:xfrm>
-                        <a:prstGeom prst="rect">
-                          <a:avLst/>
-                        </a:prstGeom>
+                        <a:prstGeom prst="rect"/>
                         <a:solidFill>
                           <a:srgbClr val="FFFFFF"/>
                         </a:solidFill>
-                        <a:ln w="0">
-                          <a:noFill/>
-                        </a:ln>
                       </wps:spPr>
-                      <wps:style>
-                        <a:lnRef idx="0"/>
-                        <a:fillRef idx="0"/>
-                        <a:effectRef idx="0"/>
-                        <a:fontRef idx="minor"/>
-                      </wps:style>
                       <wps:txbx>
                         <w:txbxContent>
                           <w:p>
@@ -1590,9 +1554,6 @@
                                   </a:graphic>
                                 </wp:inline>
                               </w:drawing>
-                            </w:r>
-                            <w:r>
-                              <w:rPr/>
                               <w:t xml:space="preserve">Figure </w:t>
                             </w:r>
                             <w:r>
@@ -1617,12 +1578,12 @@
                             </w:r>
                             <w:r>
                               <w:rPr/>
-                              <w:t>: Tour-Log-List</w:t>
+                              <w:t>: tour log list view</w:t>
                             </w:r>
                           </w:p>
                         </w:txbxContent>
                       </wps:txbx>
-                      <wps:bodyPr lIns="0" tIns="0" rIns="0" bIns="0" anchor="t">
+                      <wps:bodyPr anchor="t" lIns="0" tIns="0" rIns="0" bIns="0">
                         <a:noAutofit/>
                       </wps:bodyPr>
                     </wps:wsp>
@@ -1633,10 +1594,8 @@
           </mc:Choice>
           <mc:Fallback>
             <w:pict>
-              <v:rect id="shape_0" fillcolor="white" stroked="f" o:allowincell="f" style="position:absolute;margin-left:-33pt;margin-top:52.45pt;width:277.45pt;height:244.95pt;mso-wrap-style:square;v-text-anchor:top">
-                <v:fill o:detectmouseclick="t" type="solid" color2="black"/>
-                <v:stroke color="#3465a4" joinstyle="round" endcap="flat"/>
-                <v:textbox>
+              <v:rect style="position:absolute;rotation:-0;width:277.5pt;height:279.25pt;mso-wrap-distance-left:0pt;mso-wrap-distance-right:0pt;mso-wrap-distance-top:0pt;mso-wrap-distance-bottom:0pt;margin-top:29.9pt;mso-position-vertical-relative:text;margin-left:109.9pt;mso-position-horizontal:center;mso-position-horizontal-relative:text">
+                <v:textbox inset="0in,0in,0in,0in">
                   <w:txbxContent>
                     <w:p>
                       <w:pPr>
@@ -1684,9 +1643,6 @@
                             </a:graphic>
                           </wp:inline>
                         </w:drawing>
-                      </w:r>
-                      <w:r>
-                        <w:rPr/>
                         <w:t xml:space="preserve">Figure </w:t>
                       </w:r>
                       <w:r>
@@ -1711,7 +1667,7 @@
                       </w:r>
                       <w:r>
                         <w:rPr/>
-                        <w:t>: Tour-Log-List</w:t>
+                        <w:t>: tour log list view</w:t>
                       </w:r>
                     </w:p>
                   </w:txbxContent>
@@ -1725,6 +1681,16 @@
     </w:p>
     <w:p>
       <w:pPr>
+        <w:pStyle w:val="Normal"/>
+        <w:spacing w:before="0" w:after="0"/>
+        <w:rPr/>
+      </w:pPr>
+      <w:r>
+        <w:rPr/>
+      </w:r>
+    </w:p>
+    <w:p>
+      <w:pPr>
         <w:pStyle w:val="fhtwberschrift03ArialBlack"/>
         <w:spacing w:before="0" w:after="240"/>
         <w:rPr>
@@ -1983,37 +1949,7 @@
         <w:rPr>
           <w:lang w:val="en-US" w:eastAsia="en-US" w:bidi="ar-SA"/>
         </w:rPr>
-        <w:t xml:space="preserve">However, since the implementation of the backend </w:t>
-      </w:r>
-      <w:r>
-        <w:rPr>
-          <w:lang w:val="en-US" w:eastAsia="en-US" w:bidi="ar-SA"/>
-        </w:rPr>
-        <w:t>tour API</w:t>
-      </w:r>
-      <w:r>
-        <w:rPr>
-          <w:lang w:val="en-US" w:eastAsia="en-US" w:bidi="ar-SA"/>
-        </w:rPr>
-        <w:t xml:space="preserve">, the tours$ </w:t>
-      </w:r>
-      <w:r>
-        <w:rPr>
-          <w:lang w:val="en-US" w:eastAsia="en-US" w:bidi="ar-SA"/>
-        </w:rPr>
-        <w:t>observable</w:t>
-      </w:r>
-      <w:r>
-        <w:rPr>
-          <w:lang w:val="en-US" w:eastAsia="en-US" w:bidi="ar-SA"/>
-        </w:rPr>
-        <w:t xml:space="preserve"> is updated via asynchronous http-requests </w:t>
-      </w:r>
-      <w:r>
-        <w:rPr>
-          <w:lang w:val="en-US" w:eastAsia="en-US" w:bidi="ar-SA"/>
-        </w:rPr>
-        <w:t>to the database, which do not trigger a reload of the list view. This lead to a desynchronized interface, which only updates after the page has been interacted with.</w:t>
+        <w:t>However, since the implementation of the backend tour API, the tours$ observable is updated via asynchronous http-requests to the database, which do not trigger a reload of the list view. This lead to a desynchronized interface, which only updates after the page has been interacted with.</w:t>
       </w:r>
     </w:p>
     <w:p>
@@ -2068,11 +2004,22 @@
           <w:lang w:val="en-US" w:eastAsia="en-US" w:bidi="ar-SA"/>
         </w:rPr>
       </w:r>
-      <w:r>
+    </w:p>
+    <w:p>
+      <w:pPr>
+        <w:pStyle w:val="fhtwFlietext03Arial"/>
+        <w:rPr>
+          <w:lang w:val="en-US" w:eastAsia="en-US" w:bidi="ar-SA"/>
+        </w:rPr>
+      </w:pPr>
+      <w:r>
+        <w:rPr>
+          <w:lang w:val="en-US" w:eastAsia="en-US" w:bidi="ar-SA"/>
+        </w:rPr>
         <mc:AlternateContent>
           <mc:Choice Requires="wps">
             <w:drawing>
-              <wp:anchor distT="0" distB="0" distL="0" distR="0" simplePos="0" relativeHeight="41" behindDoc="0" locked="0" layoutInCell="0" allowOverlap="1">
+              <wp:anchor distT="0" distB="0" distL="0" distR="0" simplePos="0" relativeHeight="38" behindDoc="0" locked="0" layoutInCell="0" allowOverlap="1">
                 <wp:simplePos x="0" y="0"/>
                 <wp:positionH relativeFrom="column">
                   <wp:align>center</wp:align>
@@ -2087,17 +2034,28 @@
                 <a:graphic xmlns:a="http://schemas.openxmlformats.org/drawingml/2006/main">
                   <a:graphicData uri="http://schemas.microsoft.com/office/word/2010/wordprocessingShape">
                     <wps:wsp>
-                      <wps:cNvSpPr txBox="1"/>
+                      <wps:cNvSpPr/>
                       <wps:spPr>
                         <a:xfrm>
                           <a:off x="0" y="0"/>
-                          <a:ext cx="4114800" cy="1784350"/>
+                          <a:ext cx="4114800" cy="1784520"/>
                         </a:xfrm>
-                        <a:prstGeom prst="rect"/>
+                        <a:prstGeom prst="rect">
+                          <a:avLst/>
+                        </a:prstGeom>
                         <a:solidFill>
                           <a:srgbClr val="FFFFFF"/>
                         </a:solidFill>
+                        <a:ln w="0">
+                          <a:noFill/>
+                        </a:ln>
                       </wps:spPr>
+                      <wps:style>
+                        <a:lnRef idx="0"/>
+                        <a:fillRef idx="0"/>
+                        <a:effectRef idx="0"/>
+                        <a:fontRef idx="minor"/>
+                      </wps:style>
                       <wps:txbx>
                         <w:txbxContent>
                           <w:p>
@@ -2112,44 +2070,6 @@
                               <w:rPr>
                                 <w:lang w:val="en-US" w:eastAsia="en-US" w:bidi="ar-SA"/>
                               </w:rPr>
-                              <w:drawing>
-                                <wp:inline distT="0" distB="0" distL="0" distR="0">
-                                  <wp:extent cx="4114800" cy="1628775"/>
-                                  <wp:effectExtent l="0" t="0" r="0" b="0"/>
-                                  <wp:docPr id="17" name="Image5"/>
-                                  <wp:cNvGraphicFramePr>
-                                    <a:graphicFrameLocks xmlns:a="http://schemas.openxmlformats.org/drawingml/2006/main" noChangeAspect="1"/>
-                                  </wp:cNvGraphicFramePr>
-                                  <a:graphic xmlns:a="http://schemas.openxmlformats.org/drawingml/2006/main">
-                                    <a:graphicData uri="http://schemas.openxmlformats.org/drawingml/2006/picture">
-                                      <pic:pic xmlns:pic="http://schemas.openxmlformats.org/drawingml/2006/picture">
-                                        <pic:nvPicPr>
-                                          <pic:cNvPr id="17" name="Image5"/>
-                                          <pic:cNvPicPr>
-                                            <a:picLocks noChangeAspect="1" noChangeArrowheads="1"/>
-                                          </pic:cNvPicPr>
-                                        </pic:nvPicPr>
-                                        <pic:blipFill>
-                                          <a:blip r:embed="rId17"/>
-                                          <a:stretch>
-                                            <a:fillRect/>
-                                          </a:stretch>
-                                        </pic:blipFill>
-                                        <pic:spPr bwMode="auto">
-                                          <a:xfrm>
-                                            <a:off x="0" y="0"/>
-                                            <a:ext cx="4114800" cy="1628775"/>
-                                          </a:xfrm>
-                                          <a:prstGeom prst="rect">
-                                            <a:avLst/>
-                                          </a:prstGeom>
-                                          <a:noFill/>
-                                        </pic:spPr>
-                                      </pic:pic>
-                                    </a:graphicData>
-                                  </a:graphic>
-                                </wp:inline>
-                              </w:drawing>
                               <w:t xml:space="preserve">Figure </w:t>
                             </w:r>
                             <w:r>
@@ -2191,7 +2111,7 @@
                           </w:p>
                         </w:txbxContent>
                       </wps:txbx>
-                      <wps:bodyPr anchor="t" lIns="0" tIns="0" rIns="0" bIns="0">
+                      <wps:bodyPr lIns="0" tIns="0" rIns="0" bIns="0" anchor="t">
                         <a:noAutofit/>
                       </wps:bodyPr>
                     </wps:wsp>
@@ -2202,8 +2122,10 @@
           </mc:Choice>
           <mc:Fallback>
             <w:pict>
-              <v:rect style="position:absolute;rotation:-0;width:324pt;height:140.5pt;mso-wrap-distance-left:0pt;mso-wrap-distance-right:0pt;mso-wrap-distance-top:0pt;mso-wrap-distance-bottom:0pt;margin-top:0pt;mso-position-vertical:top;mso-position-vertical-relative:text;margin-left:86.65pt;mso-position-horizontal:center;mso-position-horizontal-relative:text">
-                <v:textbox inset="0in,0in,0in,0in">
+              <v:rect id="shape_0" fillcolor="white" stroked="f" o:allowincell="f" style="position:absolute;margin-left:86.65pt;margin-top:0.05pt;width:323.95pt;height:140.45pt;mso-wrap-style:square;v-text-anchor:top;mso-position-horizontal:center">
+                <v:fill o:detectmouseclick="t" type="solid" color2="black"/>
+                <v:stroke color="#3465a4" joinstyle="round" endcap="flat"/>
+                <v:textbox>
                   <w:txbxContent>
                     <w:p>
                       <w:pPr>
@@ -2217,44 +2139,6 @@
                         <w:rPr>
                           <w:lang w:val="en-US" w:eastAsia="en-US" w:bidi="ar-SA"/>
                         </w:rPr>
-                        <w:drawing>
-                          <wp:inline distT="0" distB="0" distL="0" distR="0">
-                            <wp:extent cx="4114800" cy="1628775"/>
-                            <wp:effectExtent l="0" t="0" r="0" b="0"/>
-                            <wp:docPr id="18" name="Image5"/>
-                            <wp:cNvGraphicFramePr>
-                              <a:graphicFrameLocks xmlns:a="http://schemas.openxmlformats.org/drawingml/2006/main" noChangeAspect="1"/>
-                            </wp:cNvGraphicFramePr>
-                            <a:graphic xmlns:a="http://schemas.openxmlformats.org/drawingml/2006/main">
-                              <a:graphicData uri="http://schemas.openxmlformats.org/drawingml/2006/picture">
-                                <pic:pic xmlns:pic="http://schemas.openxmlformats.org/drawingml/2006/picture">
-                                  <pic:nvPicPr>
-                                    <pic:cNvPr id="18" name="Image5"/>
-                                    <pic:cNvPicPr>
-                                      <a:picLocks noChangeAspect="1" noChangeArrowheads="1"/>
-                                    </pic:cNvPicPr>
-                                  </pic:nvPicPr>
-                                  <pic:blipFill>
-                                    <a:blip r:embed="rId18"/>
-                                    <a:stretch>
-                                      <a:fillRect/>
-                                    </a:stretch>
-                                  </pic:blipFill>
-                                  <pic:spPr bwMode="auto">
-                                    <a:xfrm>
-                                      <a:off x="0" y="0"/>
-                                      <a:ext cx="4114800" cy="1628775"/>
-                                    </a:xfrm>
-                                    <a:prstGeom prst="rect">
-                                      <a:avLst/>
-                                    </a:prstGeom>
-                                    <a:noFill/>
-                                  </pic:spPr>
-                                </pic:pic>
-                              </a:graphicData>
-                            </a:graphic>
-                          </wp:inline>
-                        </w:drawing>
                         <w:t xml:space="preserve">Figure </w:t>
                       </w:r>
                       <w:r>
@@ -2301,6 +2185,52 @@
             </w:pict>
           </mc:Fallback>
         </mc:AlternateContent>
+        <w:drawing>
+          <wp:anchor distT="0" distB="0" distL="0" distR="0" simplePos="0" relativeHeight="40" behindDoc="0" locked="0" layoutInCell="0" allowOverlap="1">
+            <wp:simplePos x="0" y="0"/>
+            <wp:positionH relativeFrom="column">
+              <wp:align>center</wp:align>
+            </wp:positionH>
+            <wp:positionV relativeFrom="paragraph">
+              <wp:posOffset>635</wp:posOffset>
+            </wp:positionV>
+            <wp:extent cx="4114800" cy="1628775"/>
+            <wp:effectExtent l="0" t="0" r="0" b="0"/>
+            <wp:wrapTopAndBottom/>
+            <wp:docPr id="17" name="Image5"/>
+            <wp:cNvGraphicFramePr>
+              <a:graphicFrameLocks xmlns:a="http://schemas.openxmlformats.org/drawingml/2006/main" noChangeAspect="1"/>
+            </wp:cNvGraphicFramePr>
+            <a:graphic xmlns:a="http://schemas.openxmlformats.org/drawingml/2006/main">
+              <a:graphicData uri="http://schemas.openxmlformats.org/drawingml/2006/picture">
+                <pic:pic xmlns:pic="http://schemas.openxmlformats.org/drawingml/2006/picture">
+                  <pic:nvPicPr>
+                    <pic:cNvPr id="17" name="Image5"/>
+                    <pic:cNvPicPr>
+                      <a:picLocks noChangeAspect="1" noChangeArrowheads="1"/>
+                    </pic:cNvPicPr>
+                  </pic:nvPicPr>
+                  <pic:blipFill>
+                    <a:blip r:embed="rId17"/>
+                    <a:stretch>
+                      <a:fillRect/>
+                    </a:stretch>
+                  </pic:blipFill>
+                  <pic:spPr bwMode="auto">
+                    <a:xfrm>
+                      <a:off x="0" y="0"/>
+                      <a:ext cx="4114800" cy="1628775"/>
+                    </a:xfrm>
+                    <a:prstGeom prst="rect">
+                      <a:avLst/>
+                    </a:prstGeom>
+                    <a:noFill/>
+                  </pic:spPr>
+                </pic:pic>
+              </a:graphicData>
+            </a:graphic>
+          </wp:anchor>
+        </w:drawing>
       </w:r>
     </w:p>
     <w:p>
@@ -2347,49 +2277,7 @@
         <w:rPr>
           <w:lang w:val="en-US" w:eastAsia="en-US" w:bidi="ar-SA"/>
         </w:rPr>
-        <w:t>For a tour to be created, first all necessary fields have to be filled out (Title, From,To and TransportType). Then, the user has to generat</w:t>
-      </w:r>
-      <w:r>
-        <w:rPr>
-          <w:lang w:val="en-US" w:eastAsia="en-US" w:bidi="ar-SA"/>
-        </w:rPr>
-        <w:t>e</w:t>
-      </w:r>
-      <w:r>
-        <w:rPr>
-          <w:lang w:val="en-US" w:eastAsia="en-US" w:bidi="ar-SA"/>
-        </w:rPr>
-        <w:t xml:space="preserve"> the </w:t>
-      </w:r>
-      <w:r>
-        <w:rPr>
-          <w:lang w:val="en-US" w:eastAsia="en-US" w:bidi="ar-SA"/>
-        </w:rPr>
-        <w:t>route</w:t>
-      </w:r>
-      <w:r>
-        <w:rPr>
-          <w:lang w:val="en-US" w:eastAsia="en-US" w:bidi="ar-SA"/>
-        </w:rPr>
-        <w:t xml:space="preserve"> via the “generat</w:t>
-      </w:r>
-      <w:r>
-        <w:rPr>
-          <w:lang w:val="en-US" w:eastAsia="en-US" w:bidi="ar-SA"/>
-        </w:rPr>
-        <w:t>e Route”</w:t>
-      </w:r>
-      <w:r>
-        <w:rPr>
-          <w:lang w:val="en-US" w:eastAsia="en-US" w:bidi="ar-SA"/>
-        </w:rPr>
-        <w:t xml:space="preserve"> button. </w:t>
-      </w:r>
-      <w:r>
-        <w:rPr>
-          <w:lang w:val="en-US" w:eastAsia="en-US" w:bidi="ar-SA"/>
-        </w:rPr>
-        <w:t>The component sends the information of the start and destination to the ORS-Component, who packages it as a request to the backend ORS-controller, who again sends it to the Open-Route-Service API, who should respond with a geocode json containing the coordinates of the locations. When the coordinates are received another request is send out, this time with both coordinates and the transport type, which the backend controller translates to an Open-Route-Service-API direction request. The ORS-Api should, if successful, return a summary of the route, with distance and duration as well as a list of coordinates for the leaflet service to display on the map below.</w:t>
+        <w:t>For a tour to be created, first all necessary fields have to be filled out (Title, From,To and TransportType). Then, the user has to generate the route via the “generate Route” button. The component sends the information of the start and destination to the ORS-Component, who packages it as a request to the backend ORS-controller, who again sends it to the Open-Route-Service API, who should respond with a geocode json containing the coordinates of the locations. When the coordinates are received another request is send out, this time with both coordinates and the transport type, which the backend controller translates to an Open-Route-Service-API direction request. The ORS-Api should, if successful, return a summary of the route, with distance and duration as well as a list of coordinates for the leaflet service to display on the map below.</w:t>
       </w:r>
     </w:p>
     <w:p>
@@ -2448,23 +2336,7 @@
           <w:szCs w:val="28"/>
           <w:lang w:val="en-US" w:eastAsia="en-US" w:bidi="ar-SA"/>
         </w:rPr>
-        <w:t>Tour-</w:t>
-      </w:r>
-      <w:r>
-        <w:rPr>
-          <w:sz w:val="28"/>
-          <w:szCs w:val="28"/>
-          <w:lang w:val="en-US" w:eastAsia="en-US" w:bidi="ar-SA"/>
-        </w:rPr>
-        <w:t>Detai</w:t>
-      </w:r>
-      <w:r>
-        <w:rPr>
-          <w:sz w:val="28"/>
-          <w:szCs w:val="28"/>
-          <w:lang w:val="en-US" w:eastAsia="en-US" w:bidi="ar-SA"/>
-        </w:rPr>
-        <w:t>:</w:t>
+        <w:t>Tour-Detai:</w:t>
       </w:r>
     </w:p>
     <w:p>
@@ -2839,6 +2711,7 @@
           <w:ilvl w:val="0"/>
           <w:numId w:val="1"/>
         </w:numPr>
+        <w:ind w:hanging="360" w:start="153" w:end="136"/>
         <w:rPr>
           <w:lang w:val="en-US" w:eastAsia="en-US" w:bidi="ar-SA"/>
         </w:rPr>
@@ -2857,6 +2730,7 @@
           <w:ilvl w:val="0"/>
           <w:numId w:val="1"/>
         </w:numPr>
+        <w:ind w:hanging="360" w:start="153" w:end="136"/>
         <w:rPr>
           <w:lang w:val="en-US" w:eastAsia="en-US" w:bidi="ar-SA"/>
         </w:rPr>
@@ -2875,6 +2749,7 @@
           <w:ilvl w:val="0"/>
           <w:numId w:val="1"/>
         </w:numPr>
+        <w:ind w:hanging="360" w:start="153" w:end="136"/>
         <w:rPr>
           <w:lang w:val="en-US" w:eastAsia="en-US" w:bidi="ar-SA"/>
         </w:rPr>
@@ -2893,6 +2768,7 @@
           <w:ilvl w:val="0"/>
           <w:numId w:val="1"/>
         </w:numPr>
+        <w:ind w:hanging="360" w:start="153" w:end="136"/>
         <w:rPr>
           <w:lang w:val="en-US" w:eastAsia="en-US" w:bidi="ar-SA"/>
         </w:rPr>
@@ -2911,6 +2787,7 @@
           <w:ilvl w:val="0"/>
           <w:numId w:val="1"/>
         </w:numPr>
+        <w:ind w:hanging="360" w:start="153" w:end="136"/>
         <w:rPr>
           <w:lang w:val="en-US" w:eastAsia="en-US" w:bidi="ar-SA"/>
         </w:rPr>
@@ -2929,7 +2806,7 @@
           <w:ilvl w:val="0"/>
           <w:numId w:val="0"/>
         </w:numPr>
-        <w:ind w:hanging="0" w:start="153"/>
+        <w:ind w:hanging="0" w:start="153" w:end="136"/>
         <w:rPr>
           <w:lang w:val="en-US" w:eastAsia="en-US" w:bidi="ar-SA"/>
         </w:rPr>
@@ -3035,6 +2912,7 @@
           <w:ilvl w:val="0"/>
           <w:numId w:val="2"/>
         </w:numPr>
+        <w:ind w:hanging="360" w:start="153" w:end="136"/>
         <w:rPr>
           <w:lang w:val="en-US" w:eastAsia="en-US" w:bidi="ar-SA"/>
         </w:rPr>
@@ -3053,6 +2931,7 @@
           <w:ilvl w:val="0"/>
           <w:numId w:val="2"/>
         </w:numPr>
+        <w:ind w:hanging="360" w:start="153" w:end="136"/>
         <w:rPr>
           <w:lang w:val="en-US" w:eastAsia="en-US" w:bidi="ar-SA"/>
         </w:rPr>
@@ -3142,6 +3021,33 @@
     </w:p>
     <w:p>
       <w:pPr>
+        <w:pStyle w:val="fhtwFlietext03Arial"/>
+        <w:rPr>
+          <w:lang w:val="en-US" w:eastAsia="en-US" w:bidi="ar-SA"/>
+        </w:rPr>
+      </w:pPr>
+      <w:r>
+        <w:rPr>
+          <w:lang w:val="en-US" w:eastAsia="en-US" w:bidi="ar-SA"/>
+        </w:rPr>
+        <w:t>The backend is layered in API, Business Logic and Data Access.</w:t>
+      </w:r>
+    </w:p>
+    <w:p>
+      <w:pPr>
+        <w:pStyle w:val="fhtwFlietext03Arial"/>
+        <w:rPr>
+          <w:lang w:val="en-US" w:eastAsia="en-US" w:bidi="ar-SA"/>
+        </w:rPr>
+      </w:pPr>
+      <w:r>
+        <w:rPr>
+          <w:lang w:val="en-US" w:eastAsia="en-US" w:bidi="ar-SA"/>
+        </w:rPr>
+      </w:r>
+    </w:p>
+    <w:p>
+      <w:pPr>
         <w:pStyle w:val="fhtwberschrift06Arialbold"/>
         <w:rPr>
           <w:lang w:val="en-US" w:eastAsia="en-US" w:bidi="ar-SA"/>
@@ -3229,7 +3135,253 @@
         <w:rPr>
           <w:lang w:val="en-US" w:eastAsia="en-US" w:bidi="ar-SA"/>
         </w:rPr>
-        <w:t>[How Tours are written and read to the database]</w:t>
+        <w:t>The Tour Controller API provides the frontend with the following functions to read and write tours into the database:</w:t>
+      </w:r>
+    </w:p>
+    <w:p>
+      <w:pPr>
+        <w:pStyle w:val="fhtwFlietext03Arial"/>
+        <w:rPr>
+          <w:lang w:val="en-US" w:eastAsia="en-US" w:bidi="ar-SA"/>
+        </w:rPr>
+      </w:pPr>
+      <w:r>
+        <w:rPr>
+          <w:lang w:val="en-US" w:eastAsia="en-US" w:bidi="ar-SA"/>
+        </w:rPr>
+      </w:r>
+    </w:p>
+    <w:p>
+      <w:pPr>
+        <w:pStyle w:val="fhtwFlietext03Arial"/>
+        <w:rPr>
+          <w:u w:val="single"/>
+          <w:lang w:val="en-US" w:eastAsia="en-US" w:bidi="ar-SA"/>
+        </w:rPr>
+      </w:pPr>
+      <w:r>
+        <w:rPr>
+          <w:u w:val="single"/>
+          <w:lang w:val="en-US" w:eastAsia="en-US" w:bidi="ar-SA"/>
+        </w:rPr>
+        <w:t>GetAllTours (GET /tour/{id})</w:t>
+      </w:r>
+    </w:p>
+    <w:p>
+      <w:pPr>
+        <w:pStyle w:val="fhtwFlietext03Arial"/>
+        <w:rPr>
+          <w:lang w:val="en-US" w:eastAsia="en-US" w:bidi="ar-SA"/>
+        </w:rPr>
+      </w:pPr>
+      <w:r>
+        <w:rPr>
+          <w:lang w:val="en-US" w:eastAsia="en-US" w:bidi="ar-SA"/>
+        </w:rPr>
+        <w:t>GetAllTours retrieves all tours belonging to the authenticated user by extracting the UserID from the Token. It also supports optional text-based filtering where the returned tours are filtered in the business layer by finding matches in the tour Data.</w:t>
+      </w:r>
+    </w:p>
+    <w:p>
+      <w:pPr>
+        <w:pStyle w:val="fhtwFlietext03Arial"/>
+        <w:rPr>
+          <w:lang w:val="en-US" w:eastAsia="en-US" w:bidi="ar-SA"/>
+        </w:rPr>
+      </w:pPr>
+      <w:r>
+        <w:rPr>
+          <w:lang w:val="en-US" w:eastAsia="en-US" w:bidi="ar-SA"/>
+        </w:rPr>
+        <w:t>If the Tour service in the bll returns null however, the api responds with 404 Not Found.</w:t>
+      </w:r>
+    </w:p>
+    <w:p>
+      <w:pPr>
+        <w:pStyle w:val="fhtwFlietext03Arial"/>
+        <w:rPr>
+          <w:lang w:val="en-US" w:eastAsia="en-US" w:bidi="ar-SA"/>
+        </w:rPr>
+      </w:pPr>
+      <w:r>
+        <w:rPr>
+          <w:lang w:val="en-US" w:eastAsia="en-US" w:bidi="ar-SA"/>
+        </w:rPr>
+      </w:r>
+    </w:p>
+    <w:p>
+      <w:pPr>
+        <w:pStyle w:val="fhtwFlietext03Arial"/>
+        <w:rPr>
+          <w:u w:val="single"/>
+          <w:lang w:val="en-US" w:eastAsia="en-US" w:bidi="ar-SA"/>
+        </w:rPr>
+      </w:pPr>
+      <w:r>
+        <w:rPr>
+          <w:u w:val="single"/>
+          <w:lang w:val="en-US" w:eastAsia="en-US" w:bidi="ar-SA"/>
+        </w:rPr>
+        <w:t>CreateTour (POST /tour)</w:t>
+      </w:r>
+    </w:p>
+    <w:p>
+      <w:pPr>
+        <w:pStyle w:val="fhtwFlietext03Arial"/>
+        <w:rPr>
+          <w:lang w:val="en-US" w:eastAsia="en-US" w:bidi="ar-SA"/>
+        </w:rPr>
+      </w:pPr>
+      <w:r>
+        <w:rPr>
+          <w:lang w:val="en-US" w:eastAsia="en-US" w:bidi="ar-SA"/>
+        </w:rPr>
+        <w:t xml:space="preserve">Creates a new tour for the authenticated user. The UserId gets extracted from the token and forwarded to the tour-service which calls the tour repository to save the tour into the database. </w:t>
+      </w:r>
+    </w:p>
+    <w:p>
+      <w:pPr>
+        <w:pStyle w:val="fhtwFlietext03Arial"/>
+        <w:rPr>
+          <w:lang w:val="en-US" w:eastAsia="en-US" w:bidi="ar-SA"/>
+        </w:rPr>
+      </w:pPr>
+      <w:r>
+        <w:rPr>
+          <w:lang w:val="en-US" w:eastAsia="en-US" w:bidi="ar-SA"/>
+        </w:rPr>
+      </w:r>
+    </w:p>
+    <w:p>
+      <w:pPr>
+        <w:pStyle w:val="fhtwFlietext03Arial"/>
+        <w:rPr>
+          <w:lang w:val="en-US" w:eastAsia="en-US" w:bidi="ar-SA"/>
+        </w:rPr>
+      </w:pPr>
+      <w:r>
+        <w:rPr>
+          <w:lang w:val="en-US" w:eastAsia="en-US" w:bidi="ar-SA"/>
+        </w:rPr>
+        <w:t xml:space="preserve">If the operation was successful, the API returns 201 Created with the new tour ID. </w:t>
+      </w:r>
+      <w:r>
+        <w:rPr>
+          <w:lang w:val="en-US" w:eastAsia="en-US" w:bidi="ar-SA"/>
+        </w:rPr>
+        <w:t>If the payload is invalid, it returns 400 Bad Request.</w:t>
+      </w:r>
+    </w:p>
+    <w:p>
+      <w:pPr>
+        <w:pStyle w:val="fhtwFlietext03Arial"/>
+        <w:rPr>
+          <w:lang w:val="en-US" w:eastAsia="en-US" w:bidi="ar-SA"/>
+        </w:rPr>
+      </w:pPr>
+      <w:r>
+        <w:rPr>
+          <w:lang w:val="en-US" w:eastAsia="en-US" w:bidi="ar-SA"/>
+        </w:rPr>
+      </w:r>
+    </w:p>
+    <w:p>
+      <w:pPr>
+        <w:pStyle w:val="fhtwFlietext03Arial"/>
+        <w:rPr>
+          <w:u w:val="single"/>
+          <w:lang w:val="en-US" w:eastAsia="en-US" w:bidi="ar-SA"/>
+        </w:rPr>
+      </w:pPr>
+      <w:r>
+        <w:rPr>
+          <w:u w:val="single"/>
+          <w:lang w:val="en-US" w:eastAsia="en-US" w:bidi="ar-SA"/>
+        </w:rPr>
+        <w:t>UpdateTour (PATCH /tour/{id})</w:t>
+      </w:r>
+    </w:p>
+    <w:p>
+      <w:pPr>
+        <w:pStyle w:val="fhtwFlietext03Arial"/>
+        <w:rPr>
+          <w:lang w:val="en-US" w:eastAsia="en-US" w:bidi="ar-SA"/>
+        </w:rPr>
+      </w:pPr>
+      <w:r>
+        <w:rPr>
+          <w:lang w:val="en-US" w:eastAsia="en-US" w:bidi="ar-SA"/>
+        </w:rPr>
+        <w:t>UpdateTour updated an existing tour by using the id to find the saved tour and replacing the values with the payload. It returns 204 No Content if successful and 404 Not Found if the tour id does not exist.</w:t>
+      </w:r>
+    </w:p>
+    <w:p>
+      <w:pPr>
+        <w:pStyle w:val="fhtwFlietext03Arial"/>
+        <w:rPr>
+          <w:lang w:val="en-US" w:eastAsia="en-US" w:bidi="ar-SA"/>
+        </w:rPr>
+      </w:pPr>
+      <w:r>
+        <w:rPr>
+          <w:lang w:val="en-US" w:eastAsia="en-US" w:bidi="ar-SA"/>
+        </w:rPr>
+      </w:r>
+    </w:p>
+    <w:p>
+      <w:pPr>
+        <w:pStyle w:val="fhtwFlietext03Arial"/>
+        <w:rPr>
+          <w:u w:val="single"/>
+          <w:lang w:val="en-US" w:eastAsia="en-US" w:bidi="ar-SA"/>
+        </w:rPr>
+      </w:pPr>
+      <w:r>
+        <w:rPr>
+          <w:u w:val="single"/>
+          <w:lang w:val="en-US" w:eastAsia="en-US" w:bidi="ar-SA"/>
+        </w:rPr>
+        <w:t>DeleteTour (DELETE /tour/{id})</w:t>
+      </w:r>
+    </w:p>
+    <w:p>
+      <w:pPr>
+        <w:pStyle w:val="fhtwFlietext03Arial"/>
+        <w:rPr>
+          <w:lang w:val="en-US" w:eastAsia="en-US" w:bidi="ar-SA"/>
+        </w:rPr>
+      </w:pPr>
+      <w:r>
+        <w:rPr>
+          <w:lang w:val="en-US" w:eastAsia="en-US" w:bidi="ar-SA"/>
+        </w:rPr>
+        <w:t>DeleteTour removes a tour from the repository. When the tour is sucessfully deleted, it returns 204 No Content. If the Tour Id could not be found, it returns 404 Not Found.</w:t>
+      </w:r>
+    </w:p>
+    <w:p>
+      <w:pPr>
+        <w:pStyle w:val="fhtwFlietext03Arial"/>
+        <w:rPr>
+          <w:lang w:val="en-US" w:eastAsia="en-US" w:bidi="ar-SA"/>
+        </w:rPr>
+      </w:pPr>
+      <w:r>
+        <w:rPr>
+          <w:lang w:val="en-US" w:eastAsia="en-US" w:bidi="ar-SA"/>
+        </w:rPr>
+      </w:r>
+    </w:p>
+    <w:p>
+      <w:pPr>
+        <w:pStyle w:val="fhtwFlietext03Arial"/>
+        <w:rPr>
+          <w:lang w:val="en-US" w:eastAsia="en-US" w:bidi="ar-SA"/>
+        </w:rPr>
+      </w:pPr>
+      <w:r>
+        <w:rPr>
+          <w:lang w:val="en-US" w:eastAsia="en-US" w:bidi="ar-SA"/>
+        </w:rPr>
+        <w:t>The Route is saved in form of a Json string containing the distance and duration as well as the coordinates of the route.</w:t>
       </w:r>
     </w:p>
     <w:p>
@@ -3274,7 +3426,110 @@
         <w:rPr>
           <w:lang w:val="en-US" w:eastAsia="en-US" w:bidi="ar-SA"/>
         </w:rPr>
-        <w:t>[How communication with the ORS transpires]</w:t>
+      </w:r>
+    </w:p>
+    <w:p>
+      <w:pPr>
+        <w:pStyle w:val="fhtwFlietext03Arial"/>
+        <w:rPr>
+          <w:lang w:val="en-US" w:eastAsia="en-US" w:bidi="ar-SA"/>
+        </w:rPr>
+      </w:pPr>
+      <w:r>
+        <w:rPr>
+          <w:lang w:val="en-US" w:eastAsia="en-US" w:bidi="ar-SA"/>
+        </w:rPr>
+        <w:t>The backend also serves as a proxy for the official Open-Route-Service-API and contains two functions.</w:t>
+      </w:r>
+    </w:p>
+    <w:p>
+      <w:pPr>
+        <w:pStyle w:val="fhtwFlietext03Arial"/>
+        <w:rPr>
+          <w:lang w:val="en-US" w:eastAsia="en-US" w:bidi="ar-SA"/>
+        </w:rPr>
+      </w:pPr>
+      <w:r>
+        <w:rPr>
+          <w:lang w:val="en-US" w:eastAsia="en-US" w:bidi="ar-SA"/>
+        </w:rPr>
+      </w:r>
+    </w:p>
+    <w:p>
+      <w:pPr>
+        <w:pStyle w:val="fhtwFlietext03Arial"/>
+        <w:rPr>
+          <w:lang w:val="en-US" w:eastAsia="en-US" w:bidi="ar-SA"/>
+        </w:rPr>
+      </w:pPr>
+      <w:r>
+        <w:rPr>
+          <w:u w:val="single"/>
+          <w:lang w:val="en-US" w:eastAsia="en-US" w:bidi="ar-SA"/>
+        </w:rPr>
+        <w:t>GetCoordinates – HTTPGET</w:t>
+      </w:r>
+    </w:p>
+    <w:p>
+      <w:pPr>
+        <w:pStyle w:val="fhtwFlietext03Arial"/>
+        <w:rPr>
+          <w:lang w:val="en-US" w:eastAsia="en-US" w:bidi="ar-SA"/>
+        </w:rPr>
+      </w:pPr>
+      <w:r>
+        <w:rPr>
+          <w:lang w:val="en-US" w:eastAsia="en-US" w:bidi="ar-SA"/>
+        </w:rPr>
+        <w:t xml:space="preserve">Get Coordinates </w:t>
+      </w:r>
+      <w:r>
+        <w:rPr>
+          <w:lang w:val="en-US" w:eastAsia="en-US" w:bidi="ar-SA"/>
+        </w:rPr>
+        <w:t>receives a string as a parameter, which can be a location like a city name or an adress and sends it to the business layer, which sends a request to the ORS-API and extracts the coordinates of the first entry of the response if successful. The Coordinates are then sent back.</w:t>
+      </w:r>
+    </w:p>
+    <w:p>
+      <w:pPr>
+        <w:pStyle w:val="fhtwFlietext03Arial"/>
+        <w:rPr>
+          <w:lang w:val="en-US" w:eastAsia="en-US" w:bidi="ar-SA"/>
+        </w:rPr>
+      </w:pPr>
+      <w:r>
+        <w:rPr>
+          <w:lang w:val="en-US" w:eastAsia="en-US" w:bidi="ar-SA"/>
+        </w:rPr>
+      </w:r>
+    </w:p>
+    <w:p>
+      <w:pPr>
+        <w:pStyle w:val="fhtwFlietext03Arial"/>
+        <w:rPr>
+          <w:lang w:val="en-US" w:eastAsia="en-US" w:bidi="ar-SA"/>
+        </w:rPr>
+      </w:pPr>
+      <w:r>
+        <w:rPr>
+          <w:u w:val="single"/>
+          <w:lang w:val="en-US" w:eastAsia="en-US" w:bidi="ar-SA"/>
+        </w:rPr>
+        <w:t>GetRouteInformation-HTTPPOST</w:t>
+      </w:r>
+    </w:p>
+    <w:p>
+      <w:pPr>
+        <w:pStyle w:val="fhtwFlietext03Arial"/>
+        <w:rPr>
+          <w:lang w:val="en-US" w:eastAsia="en-US" w:bidi="ar-SA"/>
+        </w:rPr>
+      </w:pPr>
+      <w:r>
+        <w:rPr>
+          <w:lang w:val="en-US" w:eastAsia="en-US" w:bidi="ar-SA"/>
+        </w:rPr>
+        <w:t>GetRouteInformation calculates the route information (distance, duration and route coordinates) based on the provided payload. The actual request to the ORS-API is sent in the business layer which in turn extracts the required information of the response and sends it back to the API.</w:t>
       </w:r>
     </w:p>
     <w:p>
@@ -3466,15 +3721,15 @@
         </w:tblCellMar>
       </w:tblPr>
       <w:tblGrid>
-        <w:gridCol w:w="1298"/>
-        <w:gridCol w:w="6582"/>
+        <w:gridCol w:w="1297"/>
+        <w:gridCol w:w="6583"/>
         <w:gridCol w:w="2040"/>
       </w:tblGrid>
       <w:tr>
         <w:trPr/>
         <w:tc>
           <w:tcPr>
-            <w:tcW w:w="1298" w:type="dxa"/>
+            <w:tcW w:w="1297" w:type="dxa"/>
             <w:tcBorders>
               <w:top w:val="single" w:sz="4" w:space="0" w:color="000000"/>
               <w:start w:val="single" w:sz="4" w:space="0" w:color="000000"/>
@@ -3499,7 +3754,7 @@
         </w:tc>
         <w:tc>
           <w:tcPr>
-            <w:tcW w:w="6582" w:type="dxa"/>
+            <w:tcW w:w="6583" w:type="dxa"/>
             <w:tcBorders>
               <w:top w:val="single" w:sz="4" w:space="0" w:color="000000"/>
               <w:start w:val="single" w:sz="4" w:space="0" w:color="000000"/>
@@ -3553,7 +3808,7 @@
         <w:trPr/>
         <w:tc>
           <w:tcPr>
-            <w:tcW w:w="1298" w:type="dxa"/>
+            <w:tcW w:w="1297" w:type="dxa"/>
             <w:tcBorders>
               <w:start w:val="single" w:sz="4" w:space="0" w:color="000000"/>
               <w:bottom w:val="single" w:sz="4" w:space="0" w:color="000000"/>
@@ -3576,7 +3831,7 @@
         </w:tc>
         <w:tc>
           <w:tcPr>
-            <w:tcW w:w="6582" w:type="dxa"/>
+            <w:tcW w:w="6583" w:type="dxa"/>
             <w:tcBorders>
               <w:start w:val="single" w:sz="4" w:space="0" w:color="000000"/>
               <w:bottom w:val="single" w:sz="4" w:space="0" w:color="000000"/>
@@ -3626,7 +3881,7 @@
         <w:trPr/>
         <w:tc>
           <w:tcPr>
-            <w:tcW w:w="1298" w:type="dxa"/>
+            <w:tcW w:w="1297" w:type="dxa"/>
             <w:tcBorders>
               <w:start w:val="single" w:sz="4" w:space="0" w:color="000000"/>
               <w:bottom w:val="single" w:sz="4" w:space="0" w:color="000000"/>
@@ -3649,7 +3904,7 @@
         </w:tc>
         <w:tc>
           <w:tcPr>
-            <w:tcW w:w="6582" w:type="dxa"/>
+            <w:tcW w:w="6583" w:type="dxa"/>
             <w:tcBorders>
               <w:start w:val="single" w:sz="4" w:space="0" w:color="000000"/>
               <w:bottom w:val="single" w:sz="4" w:space="0" w:color="000000"/>
@@ -3699,7 +3954,7 @@
         <w:trPr/>
         <w:tc>
           <w:tcPr>
-            <w:tcW w:w="1298" w:type="dxa"/>
+            <w:tcW w:w="1297" w:type="dxa"/>
             <w:tcBorders>
               <w:start w:val="single" w:sz="4" w:space="0" w:color="000000"/>
               <w:bottom w:val="single" w:sz="4" w:space="0" w:color="000000"/>
@@ -3722,7 +3977,7 @@
         </w:tc>
         <w:tc>
           <w:tcPr>
-            <w:tcW w:w="6582" w:type="dxa"/>
+            <w:tcW w:w="6583" w:type="dxa"/>
             <w:tcBorders>
               <w:start w:val="single" w:sz="4" w:space="0" w:color="000000"/>
               <w:bottom w:val="single" w:sz="4" w:space="0" w:color="000000"/>
@@ -3772,7 +4027,7 @@
         <w:trPr/>
         <w:tc>
           <w:tcPr>
-            <w:tcW w:w="1298" w:type="dxa"/>
+            <w:tcW w:w="1297" w:type="dxa"/>
             <w:tcBorders>
               <w:start w:val="single" w:sz="4" w:space="0" w:color="000000"/>
               <w:bottom w:val="single" w:sz="4" w:space="0" w:color="000000"/>
@@ -3795,7 +4050,7 @@
         </w:tc>
         <w:tc>
           <w:tcPr>
-            <w:tcW w:w="6582" w:type="dxa"/>
+            <w:tcW w:w="6583" w:type="dxa"/>
             <w:tcBorders>
               <w:start w:val="single" w:sz="4" w:space="0" w:color="000000"/>
               <w:bottom w:val="single" w:sz="4" w:space="0" w:color="000000"/>
@@ -3845,7 +4100,7 @@
         <w:trPr/>
         <w:tc>
           <w:tcPr>
-            <w:tcW w:w="1298" w:type="dxa"/>
+            <w:tcW w:w="1297" w:type="dxa"/>
             <w:tcBorders>
               <w:start w:val="single" w:sz="4" w:space="0" w:color="000000"/>
               <w:bottom w:val="single" w:sz="4" w:space="0" w:color="000000"/>
@@ -3868,7 +4123,7 @@
         </w:tc>
         <w:tc>
           <w:tcPr>
-            <w:tcW w:w="6582" w:type="dxa"/>
+            <w:tcW w:w="6583" w:type="dxa"/>
             <w:tcBorders>
               <w:start w:val="single" w:sz="4" w:space="0" w:color="000000"/>
               <w:bottom w:val="single" w:sz="4" w:space="0" w:color="000000"/>
@@ -3918,7 +4173,7 @@
         <w:trPr/>
         <w:tc>
           <w:tcPr>
-            <w:tcW w:w="1298" w:type="dxa"/>
+            <w:tcW w:w="1297" w:type="dxa"/>
             <w:tcBorders>
               <w:start w:val="single" w:sz="4" w:space="0" w:color="000000"/>
               <w:bottom w:val="single" w:sz="4" w:space="0" w:color="000000"/>
@@ -3941,7 +4196,7 @@
         </w:tc>
         <w:tc>
           <w:tcPr>
-            <w:tcW w:w="6582" w:type="dxa"/>
+            <w:tcW w:w="6583" w:type="dxa"/>
             <w:tcBorders>
               <w:start w:val="single" w:sz="4" w:space="0" w:color="000000"/>
               <w:bottom w:val="single" w:sz="4" w:space="0" w:color="000000"/>
@@ -3991,7 +4246,7 @@
         <w:trPr/>
         <w:tc>
           <w:tcPr>
-            <w:tcW w:w="1298" w:type="dxa"/>
+            <w:tcW w:w="1297" w:type="dxa"/>
             <w:tcBorders>
               <w:start w:val="single" w:sz="4" w:space="0" w:color="000000"/>
               <w:bottom w:val="single" w:sz="4" w:space="0" w:color="000000"/>
@@ -4014,7 +4269,7 @@
         </w:tc>
         <w:tc>
           <w:tcPr>
-            <w:tcW w:w="6582" w:type="dxa"/>
+            <w:tcW w:w="6583" w:type="dxa"/>
             <w:tcBorders>
               <w:start w:val="single" w:sz="4" w:space="0" w:color="000000"/>
               <w:bottom w:val="single" w:sz="4" w:space="0" w:color="000000"/>
@@ -4064,7 +4319,7 @@
         <w:trPr/>
         <w:tc>
           <w:tcPr>
-            <w:tcW w:w="1298" w:type="dxa"/>
+            <w:tcW w:w="1297" w:type="dxa"/>
             <w:tcBorders>
               <w:start w:val="single" w:sz="4" w:space="0" w:color="000000"/>
               <w:bottom w:val="single" w:sz="4" w:space="0" w:color="000000"/>
@@ -4087,7 +4342,7 @@
         </w:tc>
         <w:tc>
           <w:tcPr>
-            <w:tcW w:w="6582" w:type="dxa"/>
+            <w:tcW w:w="6583" w:type="dxa"/>
             <w:tcBorders>
               <w:start w:val="single" w:sz="4" w:space="0" w:color="000000"/>
               <w:bottom w:val="single" w:sz="4" w:space="0" w:color="000000"/>
@@ -4137,7 +4392,7 @@
         <w:trPr/>
         <w:tc>
           <w:tcPr>
-            <w:tcW w:w="1298" w:type="dxa"/>
+            <w:tcW w:w="1297" w:type="dxa"/>
             <w:tcBorders>
               <w:start w:val="single" w:sz="4" w:space="0" w:color="000000"/>
               <w:bottom w:val="single" w:sz="4" w:space="0" w:color="000000"/>
@@ -4160,7 +4415,7 @@
         </w:tc>
         <w:tc>
           <w:tcPr>
-            <w:tcW w:w="6582" w:type="dxa"/>
+            <w:tcW w:w="6583" w:type="dxa"/>
             <w:tcBorders>
               <w:start w:val="single" w:sz="4" w:space="0" w:color="000000"/>
               <w:bottom w:val="single" w:sz="4" w:space="0" w:color="000000"/>
@@ -4210,7 +4465,7 @@
         <w:trPr/>
         <w:tc>
           <w:tcPr>
-            <w:tcW w:w="1298" w:type="dxa"/>
+            <w:tcW w:w="1297" w:type="dxa"/>
             <w:tcBorders>
               <w:start w:val="single" w:sz="4" w:space="0" w:color="000000"/>
               <w:bottom w:val="single" w:sz="4" w:space="0" w:color="000000"/>
@@ -4233,7 +4488,7 @@
         </w:tc>
         <w:tc>
           <w:tcPr>
-            <w:tcW w:w="6582" w:type="dxa"/>
+            <w:tcW w:w="6583" w:type="dxa"/>
             <w:tcBorders>
               <w:start w:val="single" w:sz="4" w:space="0" w:color="000000"/>
               <w:bottom w:val="single" w:sz="4" w:space="0" w:color="000000"/>
@@ -4283,7 +4538,7 @@
         <w:trPr/>
         <w:tc>
           <w:tcPr>
-            <w:tcW w:w="1298" w:type="dxa"/>
+            <w:tcW w:w="1297" w:type="dxa"/>
             <w:tcBorders>
               <w:start w:val="single" w:sz="4" w:space="0" w:color="000000"/>
               <w:bottom w:val="single" w:sz="4" w:space="0" w:color="000000"/>
@@ -4306,7 +4561,7 @@
         </w:tc>
         <w:tc>
           <w:tcPr>
-            <w:tcW w:w="6582" w:type="dxa"/>
+            <w:tcW w:w="6583" w:type="dxa"/>
             <w:tcBorders>
               <w:start w:val="single" w:sz="4" w:space="0" w:color="000000"/>
               <w:bottom w:val="single" w:sz="4" w:space="0" w:color="000000"/>
@@ -4356,7 +4611,7 @@
         <w:trPr/>
         <w:tc>
           <w:tcPr>
-            <w:tcW w:w="1298" w:type="dxa"/>
+            <w:tcW w:w="1297" w:type="dxa"/>
             <w:tcBorders>
               <w:start w:val="single" w:sz="4" w:space="0" w:color="000000"/>
               <w:bottom w:val="single" w:sz="4" w:space="0" w:color="000000"/>
@@ -4379,7 +4634,7 @@
         </w:tc>
         <w:tc>
           <w:tcPr>
-            <w:tcW w:w="6582" w:type="dxa"/>
+            <w:tcW w:w="6583" w:type="dxa"/>
             <w:tcBorders>
               <w:start w:val="single" w:sz="4" w:space="0" w:color="000000"/>
               <w:bottom w:val="single" w:sz="4" w:space="0" w:color="000000"/>
@@ -4429,7 +4684,7 @@
         <w:trPr/>
         <w:tc>
           <w:tcPr>
-            <w:tcW w:w="1298" w:type="dxa"/>
+            <w:tcW w:w="1297" w:type="dxa"/>
             <w:tcBorders>
               <w:start w:val="single" w:sz="4" w:space="0" w:color="000000"/>
               <w:bottom w:val="single" w:sz="4" w:space="0" w:color="000000"/>
@@ -4452,7 +4707,7 @@
         </w:tc>
         <w:tc>
           <w:tcPr>
-            <w:tcW w:w="6582" w:type="dxa"/>
+            <w:tcW w:w="6583" w:type="dxa"/>
             <w:tcBorders>
               <w:start w:val="single" w:sz="4" w:space="0" w:color="000000"/>
               <w:bottom w:val="single" w:sz="4" w:space="0" w:color="000000"/>
@@ -4502,7 +4757,7 @@
         <w:trPr/>
         <w:tc>
           <w:tcPr>
-            <w:tcW w:w="1298" w:type="dxa"/>
+            <w:tcW w:w="1297" w:type="dxa"/>
             <w:tcBorders>
               <w:start w:val="single" w:sz="4" w:space="0" w:color="000000"/>
               <w:bottom w:val="single" w:sz="4" w:space="0" w:color="000000"/>
@@ -4525,7 +4780,7 @@
         </w:tc>
         <w:tc>
           <w:tcPr>
-            <w:tcW w:w="6582" w:type="dxa"/>
+            <w:tcW w:w="6583" w:type="dxa"/>
             <w:tcBorders>
               <w:start w:val="single" w:sz="4" w:space="0" w:color="000000"/>
               <w:bottom w:val="single" w:sz="4" w:space="0" w:color="000000"/>
@@ -4586,12 +4841,12 @@
       </w:r>
     </w:p>
     <w:sectPr>
-      <w:headerReference w:type="even" r:id="rId19"/>
-      <w:headerReference w:type="default" r:id="rId20"/>
-      <w:headerReference w:type="first" r:id="rId21"/>
-      <w:footerReference w:type="even" r:id="rId22"/>
-      <w:footerReference w:type="default" r:id="rId23"/>
-      <w:footerReference w:type="first" r:id="rId24"/>
+      <w:headerReference w:type="even" r:id="rId18"/>
+      <w:headerReference w:type="default" r:id="rId19"/>
+      <w:headerReference w:type="first" r:id="rId20"/>
+      <w:footerReference w:type="even" r:id="rId21"/>
+      <w:footerReference w:type="default" r:id="rId22"/>
+      <w:footerReference w:type="first" r:id="rId23"/>
       <w:type w:val="nextPage"/>
       <w:pgSz w:w="11906" w:h="16838"/>
       <w:pgMar w:left="1680" w:right="280" w:gutter="0" w:header="720" w:top="777" w:footer="720" w:bottom="1680"/>
@@ -4671,7 +4926,7 @@
                       <w:txbxContent>
                         <w:p>
                           <w:pPr>
-                            <w:pStyle w:val="FrameContents"/>
+                            <w:pStyle w:val="FrameContentsuser"/>
                             <w:jc w:val="end"/>
                             <w:rPr>
                               <w:rFonts w:ascii="Arial" w:hAnsi="Arial" w:eastAsia="" w:cs="Arial" w:eastAsiaTheme="majorEastAsia"/>
@@ -4769,7 +5024,7 @@
                 <w:txbxContent>
                   <w:p>
                     <w:pPr>
-                      <w:pStyle w:val="FrameContents"/>
+                      <w:pStyle w:val="FrameContentsuser"/>
                       <w:jc w:val="end"/>
                       <w:rPr>
                         <w:rFonts w:ascii="Arial" w:hAnsi="Arial" w:eastAsia="" w:cs="Arial" w:eastAsiaTheme="majorEastAsia"/>
@@ -4942,7 +5197,7 @@
     <w:r>
       <w:rPr/>
       <w:drawing>
-        <wp:anchor distT="0" distB="0" distL="0" distR="0" simplePos="0" relativeHeight="11" behindDoc="1" locked="0" layoutInCell="1" allowOverlap="1">
+        <wp:anchor distT="0" distB="0" distL="0" distR="0" simplePos="0" relativeHeight="12" behindDoc="1" locked="0" layoutInCell="1" allowOverlap="1">
           <wp:simplePos x="0" y="0"/>
           <wp:positionH relativeFrom="column">
             <wp:posOffset>-1066800</wp:posOffset>
@@ -4953,7 +5208,7 @@
           <wp:extent cx="7554595" cy="432435"/>
           <wp:effectExtent l="0" t="0" r="0" b="0"/>
           <wp:wrapNone/>
-          <wp:docPr id="19" name="Grafik 38 Copy 1"/>
+          <wp:docPr id="18" name="Grafik 38 Copy 1"/>
           <wp:cNvGraphicFramePr>
             <a:graphicFrameLocks xmlns:a="http://schemas.openxmlformats.org/drawingml/2006/main" noChangeAspect="1"/>
           </wp:cNvGraphicFramePr>
@@ -4961,7 +5216,7 @@
             <a:graphicData uri="http://schemas.openxmlformats.org/drawingml/2006/picture">
               <pic:pic xmlns:pic="http://schemas.openxmlformats.org/drawingml/2006/picture">
                 <pic:nvPicPr>
-                  <pic:cNvPr id="19" name="Grafik 38 Copy 1"/>
+                  <pic:cNvPr id="18" name="Grafik 38 Copy 1"/>
                   <pic:cNvPicPr>
                     <a:picLocks noChangeAspect="1" noChangeArrowheads="1"/>
                   </pic:cNvPicPr>
@@ -4990,7 +5245,7 @@
       <mc:AlternateContent>
         <mc:Choice Requires="wps">
           <w:drawing>
-            <wp:anchor distT="0" distB="0" distL="0" distR="0" simplePos="0" relativeHeight="26" behindDoc="1" locked="0" layoutInCell="0" allowOverlap="1" wp14:anchorId="33EA5CF7">
+            <wp:anchor distT="0" distB="0" distL="0" distR="0" simplePos="0" relativeHeight="29" behindDoc="1" locked="0" layoutInCell="0" allowOverlap="1" wp14:anchorId="33EA5CF7">
               <wp:simplePos x="0" y="0"/>
               <wp:positionH relativeFrom="rightMargin">
                 <wp:posOffset>-1252220</wp:posOffset>
@@ -5001,7 +5256,7 @@
               <wp:extent cx="1155065" cy="212090"/>
               <wp:effectExtent l="0" t="0" r="0" b="0"/>
               <wp:wrapNone/>
-              <wp:docPr id="20" name="Rectangle 2"/>
+              <wp:docPr id="19" name="Rectangle 2"/>
               <a:graphic xmlns:a="http://schemas.openxmlformats.org/drawingml/2006/main">
                 <a:graphicData uri="http://schemas.microsoft.com/office/word/2010/wordprocessingShape">
                   <wps:wsp>
@@ -5031,7 +5286,7 @@
                       <w:txbxContent>
                         <w:p>
                           <w:pPr>
-                            <w:pStyle w:val="FrameContents"/>
+                            <w:pStyle w:val="FrameContentsuser"/>
                             <w:jc w:val="end"/>
                             <w:rPr>
                               <w:rFonts w:ascii="Arial" w:hAnsi="Arial" w:eastAsia="" w:cs="Arial" w:eastAsiaTheme="majorEastAsia"/>
@@ -5087,7 +5342,7 @@
                                   <w:sz w:val="20"/>
                                   <w:szCs w:val="20"/>
                                 </w:rPr>
-                                <w:t>9</w:t>
+                                <w:t>10</w:t>
                               </w:r>
                               <w:r>
                                 <w:rPr>
@@ -5129,7 +5384,7 @@
                 <w:txbxContent>
                   <w:p>
                     <w:pPr>
-                      <w:pStyle w:val="FrameContents"/>
+                      <w:pStyle w:val="FrameContentsuser"/>
                       <w:jc w:val="end"/>
                       <w:rPr>
                         <w:rFonts w:ascii="Arial" w:hAnsi="Arial" w:eastAsia="" w:cs="Arial" w:eastAsiaTheme="majorEastAsia"/>
@@ -5185,7 +5440,7 @@
                             <w:sz w:val="20"/>
                             <w:szCs w:val="20"/>
                           </w:rPr>
-                          <w:t>9</w:t>
+                          <w:t>10</w:t>
                         </w:r>
                         <w:r>
                           <w:rPr>
@@ -5229,7 +5484,7 @@
     <w:r>
       <w:rPr/>
       <w:drawing>
-        <wp:anchor distT="0" distB="0" distL="0" distR="0" simplePos="0" relativeHeight="11" behindDoc="1" locked="0" layoutInCell="1" allowOverlap="1">
+        <wp:anchor distT="0" distB="0" distL="0" distR="0" simplePos="0" relativeHeight="12" behindDoc="1" locked="0" layoutInCell="1" allowOverlap="1">
           <wp:simplePos x="0" y="0"/>
           <wp:positionH relativeFrom="column">
             <wp:posOffset>-1066800</wp:posOffset>
@@ -5240,7 +5495,7 @@
           <wp:extent cx="7554595" cy="432435"/>
           <wp:effectExtent l="0" t="0" r="0" b="0"/>
           <wp:wrapNone/>
-          <wp:docPr id="21" name="Grafik 38 Copy 1"/>
+          <wp:docPr id="20" name="Grafik 38 Copy 1"/>
           <wp:cNvGraphicFramePr>
             <a:graphicFrameLocks xmlns:a="http://schemas.openxmlformats.org/drawingml/2006/main" noChangeAspect="1"/>
           </wp:cNvGraphicFramePr>
@@ -5248,7 +5503,7 @@
             <a:graphicData uri="http://schemas.openxmlformats.org/drawingml/2006/picture">
               <pic:pic xmlns:pic="http://schemas.openxmlformats.org/drawingml/2006/picture">
                 <pic:nvPicPr>
-                  <pic:cNvPr id="21" name="Grafik 38 Copy 1"/>
+                  <pic:cNvPr id="20" name="Grafik 38 Copy 1"/>
                   <pic:cNvPicPr>
                     <a:picLocks noChangeAspect="1" noChangeArrowheads="1"/>
                   </pic:cNvPicPr>
@@ -5277,7 +5532,7 @@
       <mc:AlternateContent>
         <mc:Choice Requires="wps">
           <w:drawing>
-            <wp:anchor distT="0" distB="0" distL="0" distR="0" simplePos="0" relativeHeight="26" behindDoc="1" locked="0" layoutInCell="0" allowOverlap="1" wp14:anchorId="33EA5CF7">
+            <wp:anchor distT="0" distB="0" distL="0" distR="0" simplePos="0" relativeHeight="29" behindDoc="1" locked="0" layoutInCell="0" allowOverlap="1" wp14:anchorId="33EA5CF7">
               <wp:simplePos x="0" y="0"/>
               <wp:positionH relativeFrom="rightMargin">
                 <wp:posOffset>-1252220</wp:posOffset>
@@ -5288,7 +5543,7 @@
               <wp:extent cx="1155065" cy="212090"/>
               <wp:effectExtent l="0" t="0" r="0" b="0"/>
               <wp:wrapNone/>
-              <wp:docPr id="22" name="Rectangle 2"/>
+              <wp:docPr id="21" name="Rectangle 2"/>
               <a:graphic xmlns:a="http://schemas.openxmlformats.org/drawingml/2006/main">
                 <a:graphicData uri="http://schemas.microsoft.com/office/word/2010/wordprocessingShape">
                   <wps:wsp>
@@ -5318,7 +5573,7 @@
                       <w:txbxContent>
                         <w:p>
                           <w:pPr>
-                            <w:pStyle w:val="FrameContents"/>
+                            <w:pStyle w:val="FrameContentsuser"/>
                             <w:jc w:val="end"/>
                             <w:rPr>
                               <w:rFonts w:ascii="Arial" w:hAnsi="Arial" w:eastAsia="" w:cs="Arial" w:eastAsiaTheme="majorEastAsia"/>
@@ -5374,7 +5629,7 @@
                                   <w:sz w:val="20"/>
                                   <w:szCs w:val="20"/>
                                 </w:rPr>
-                                <w:t>9</w:t>
+                                <w:t>10</w:t>
                               </w:r>
                               <w:r>
                                 <w:rPr>
@@ -5416,7 +5671,7 @@
                 <w:txbxContent>
                   <w:p>
                     <w:pPr>
-                      <w:pStyle w:val="FrameContents"/>
+                      <w:pStyle w:val="FrameContentsuser"/>
                       <w:jc w:val="end"/>
                       <w:rPr>
                         <w:rFonts w:ascii="Arial" w:hAnsi="Arial" w:eastAsia="" w:cs="Arial" w:eastAsiaTheme="majorEastAsia"/>
@@ -5472,7 +5727,7 @@
                             <w:sz w:val="20"/>
                             <w:szCs w:val="20"/>
                           </w:rPr>
-                          <w:t>9</w:t>
+                          <w:t>10</w:t>
                         </w:r>
                         <w:r>
                           <w:rPr>
@@ -6852,8 +7107,8 @@
       <w:lang w:val="de-DE"/>
     </w:rPr>
   </w:style>
-  <w:style w:type="character" w:styleId="Bullets">
-    <w:name w:val="Bullets"/>
+  <w:style w:type="character" w:styleId="Bulletsuser">
+    <w:name w:val="Bullets (user)"/>
     <w:qFormat/>
     <w:rPr>
       <w:rFonts w:ascii="OpenSymbol" w:hAnsi="OpenSymbol" w:eastAsia="OpenSymbol" w:cs="OpenSymbol"/>
@@ -7203,8 +7458,8 @@
       <w:lang w:val="en-US" w:eastAsia="zh-CN" w:bidi="hi-IN"/>
     </w:rPr>
   </w:style>
-  <w:style w:type="paragraph" w:styleId="FrameContents">
-    <w:name w:val="Frame Contents"/>
+  <w:style w:type="paragraph" w:styleId="FrameContentsuser">
+    <w:name w:val="Frame Contents (user)"/>
     <w:basedOn w:val="Normal"/>
     <w:qFormat/>
     <w:pPr/>
@@ -7220,8 +7475,8 @@
     </w:pPr>
     <w:rPr/>
   </w:style>
-  <w:style w:type="paragraph" w:styleId="FrameContentsuser">
-    <w:name w:val="Frame Contents (user)"/>
+  <w:style w:type="paragraph" w:styleId="FrameContents">
+    <w:name w:val="Frame Contents"/>
     <w:basedOn w:val="Normal"/>
     <w:qFormat/>
     <w:pPr/>

</xml_diff>